<commit_message>
feat(ventas): NC/ND sobre cualquier factura emitida y NC/ND libre con período o comprobante asociado (migración 075)
- Un solo modal NC/ND (radio) sobre facturas con venta o directas; ND sin
  tope, NC con reserva server-side. Asiento único armarLineasNota
  (auto-nc / auto-nd); cta cte suma la ND como cargo; backfill cubre ND.
- Modal NC/ND libre: cliente, clase, moneda, ítems libres y asociación
  obligatoria (PeriodoAsoc o CbteAsoc externo, RG 4540); columnas nuevas
  periodo_asoc_desde/hasta y cbte_asoc_externo.
- fn_nc_tope y nc_reservar re-emitidas: el tope sólo cuenta tipos NC.
- Edge Function facturacion: periodo_asociado, tipos M 52/53 (deno check OK).
- 15 tests nuevos (tests/notas-venta.test.js); suite 257/257.
- Manual 8.3, CLAUDE.md, spec.

Co-Authored-By: Claude Fable 5.1 <noreply@anthropic.com>
Claude-Session: https://claude.ai/code/session_01RyfzZXsyNFM6WEBySPaUFt
</commit_message>
<xml_diff>
--- a/docs/MANUAL_USUARIO.docx
+++ b/docs/MANUAL_USUARIO.docx
@@ -10249,6 +10249,193 @@
       </w:r>
       <w:r>
         <w:t xml:space="preserve">— una vez facturada, este botón te deja ver/descargar la factura.</w:t>
+      </w:r>
+      <w:r>
+        <w:t xml:space="preserve"> </w:t>
+      </w:r>
+      <w:r>
+        <w:t xml:space="preserve">-</w:t>
+      </w:r>
+      <w:r>
+        <w:t xml:space="preserve"> </w:t>
+      </w:r>
+      <w:r>
+        <w:rPr>
+          <w:b/>
+          <w:bCs/>
+        </w:rPr>
+        <w:t xml:space="preserve">NC/ND</w:t>
+      </w:r>
+      <w:r>
+        <w:t xml:space="preserve"> </w:t>
+      </w:r>
+      <w:r>
+        <w:t xml:space="preserve">— emite una</w:t>
+      </w:r>
+      <w:r>
+        <w:t xml:space="preserve"> </w:t>
+      </w:r>
+      <w:r>
+        <w:rPr>
+          <w:b/>
+          <w:bCs/>
+        </w:rPr>
+        <w:t xml:space="preserve">nota de crédito o de débito con CAE</w:t>
+      </w:r>
+      <w:r>
+        <w:t xml:space="preserve"> </w:t>
+      </w:r>
+      <w:r>
+        <w:t xml:space="preserve">sobre esa factura. Elegís la clase arriba del modal:</w:t>
+      </w:r>
+      <w:r>
+        <w:t xml:space="preserve"> </w:t>
+      </w:r>
+      <w:r>
+        <w:t xml:space="preserve">-</w:t>
+      </w:r>
+      <w:r>
+        <w:t xml:space="preserve"> </w:t>
+      </w:r>
+      <w:r>
+        <w:rPr>
+          <w:b/>
+          <w:bCs/>
+        </w:rPr>
+        <w:t xml:space="preserve">Nota de crédito</w:t>
+      </w:r>
+      <w:r>
+        <w:t xml:space="preserve"> </w:t>
+      </w:r>
+      <w:r>
+        <w:t xml:space="preserve">(resta): devolución, error de facturación, descuento. Total o parcial; el sistema no deja acreditar más que el saldo de la factura (las NC anteriores se descuentan, las ND no).</w:t>
+      </w:r>
+      <w:r>
+        <w:t xml:space="preserve"> </w:t>
+      </w:r>
+      <w:r>
+        <w:t xml:space="preserve">-</w:t>
+      </w:r>
+      <w:r>
+        <w:t xml:space="preserve"> </w:t>
+      </w:r>
+      <w:r>
+        <w:rPr>
+          <w:b/>
+          <w:bCs/>
+        </w:rPr>
+        <w:t xml:space="preserve">Nota de débito</w:t>
+      </w:r>
+      <w:r>
+        <w:t xml:space="preserve"> </w:t>
+      </w:r>
+      <w:r>
+        <w:t xml:space="preserve">(suma): intereses por mora, diferencia de precio, gastos. No tiene tope.</w:t>
+      </w:r>
+      <w:r>
+        <w:t xml:space="preserve"> </w:t>
+      </w:r>
+      <w:r>
+        <w:t xml:space="preserve">- El asiento se arma solo y la cuenta corriente del cliente baja (NC) o sube (ND). La letra es la de la factura original.</w:t>
+      </w:r>
+      <w:r>
+        <w:t xml:space="preserve"> </w:t>
+      </w:r>
+      <w:r>
+        <w:t xml:space="preserve">-</w:t>
+      </w:r>
+      <w:r>
+        <w:t xml:space="preserve"> </w:t>
+      </w:r>
+      <w:r>
+        <w:rPr>
+          <w:b/>
+          <w:bCs/>
+        </w:rPr>
+        <w:t xml:space="preserve">Facturas directas y notas libres</w:t>
+      </w:r>
+      <w:r>
+        <w:t xml:space="preserve"> </w:t>
+      </w:r>
+      <w:r>
+        <w:t xml:space="preserve">(botones de la barra): una</w:t>
+      </w:r>
+      <w:r>
+        <w:t xml:space="preserve"> </w:t>
+      </w:r>
+      <w:r>
+        <w:rPr>
+          <w:b/>
+          <w:bCs/>
+        </w:rPr>
+        <w:t xml:space="preserve">factura directa</w:t>
+      </w:r>
+      <w:r>
+        <w:t xml:space="preserve"> </w:t>
+      </w:r>
+      <w:r>
+        <w:t xml:space="preserve">se emite sin venta (ver más abajo) y desde su fila también podés sacar su NC/ND.</w:t>
+      </w:r>
+      <w:r>
+        <w:t xml:space="preserve"> </w:t>
+      </w:r>
+      <w:r>
+        <w:rPr>
+          <w:b/>
+          <w:bCs/>
+        </w:rPr>
+        <w:t xml:space="preserve">+ NC/ND libre</w:t>
+      </w:r>
+      <w:r>
+        <w:t xml:space="preserve"> </w:t>
+      </w:r>
+      <w:r>
+        <w:t xml:space="preserve">emite una nota que</w:t>
+      </w:r>
+      <w:r>
+        <w:t xml:space="preserve"> </w:t>
+      </w:r>
+      <w:r>
+        <w:rPr>
+          <w:b/>
+          <w:bCs/>
+        </w:rPr>
+        <w:t xml:space="preserve">no corrige ninguna factura del ERP</w:t>
+      </w:r>
+      <w:r>
+        <w:t xml:space="preserve">: ARCA exige asociarla a un</w:t>
+      </w:r>
+      <w:r>
+        <w:t xml:space="preserve"> </w:t>
+      </w:r>
+      <w:r>
+        <w:rPr>
+          <w:b/>
+          <w:bCs/>
+        </w:rPr>
+        <w:t xml:space="preserve">período</w:t>
+      </w:r>
+      <w:r>
+        <w:t xml:space="preserve"> </w:t>
+      </w:r>
+      <w:r>
+        <w:t xml:space="preserve">(desde/hasta: descuentos por volumen, intereses del mes, ajustes globales) o a un</w:t>
+      </w:r>
+      <w:r>
+        <w:t xml:space="preserve"> </w:t>
+      </w:r>
+      <w:r>
+        <w:rPr>
+          <w:b/>
+          <w:bCs/>
+        </w:rPr>
+        <w:t xml:space="preserve">comprobante propio</w:t>
+      </w:r>
+      <w:r>
+        <w:t xml:space="preserve"> </w:t>
+      </w:r>
+      <w:r>
+        <w:t xml:space="preserve">emitido fuera del sistema (punto de venta y número de esa factura, misma letra). Elegís cliente, tipo, moneda e ítems con concepto libre, igual que en la factura directa.</w:t>
       </w:r>
       <w:r>
         <w:t xml:space="preserve"> </w:t>

</xml_diff>

<commit_message>
docs(sueldos): manual y CLAUDE.md para el motor de liquidación 083
Co-Authored-By: Claude Fable 5.1 <noreply@anthropic.com>
</commit_message>
<xml_diff>
--- a/docs/MANUAL_USUARIO.docx
+++ b/docs/MANUAL_USUARIO.docx
@@ -2,7 +2,7 @@
 <file path=word/document.xml><?xml version="1.0" encoding="utf-8"?>
 <w:document xmlns:w="http://schemas.openxmlformats.org/wordprocessingml/2006/main" xmlns:m="http://schemas.openxmlformats.org/officeDocument/2006/math" xmlns:r="http://schemas.openxmlformats.org/officeDocument/2006/relationships" xmlns:o="urn:schemas-microsoft-com:office:office" xmlns:v="urn:schemas-microsoft-com:vml" xmlns:w10="urn:schemas-microsoft-com:office:word" xmlns:a="http://schemas.openxmlformats.org/drawingml/2006/main" xmlns:pic="http://schemas.openxmlformats.org/drawingml/2006/picture" xmlns:wp="http://schemas.openxmlformats.org/drawingml/2006/wordprocessingDrawing">
   <w:body>
-    <w:bookmarkStart w:id="72" w:name="X49288d98bb0e101ac90548faf60c95f63953311"/>
+    <w:bookmarkStart w:id="79" w:name="X49288d98bb0e101ac90548faf60c95f63953311"/>
     <w:p>
       <w:pPr>
         <w:pStyle w:val="Heading1"/>
@@ -13935,7 +13935,7 @@
     </w:p>
     <w:bookmarkEnd w:id="49"/>
     <w:bookmarkEnd w:id="50"/>
-    <w:bookmarkStart w:id="60" w:name="contabilidad"/>
+    <w:bookmarkStart w:id="67" w:name="contabilidad"/>
     <w:p>
       <w:pPr>
         <w:pStyle w:val="Heading2"/>
@@ -16629,13 +16629,13 @@
       </w:r>
     </w:p>
     <w:bookmarkEnd w:id="58"/>
-    <w:bookmarkStart w:id="59" w:name="sueldos-y-libro-de-sueldos-digital-arca"/>
+    <w:bookmarkStart w:id="66" w:name="X5261329946751d1b2deba0ff3bf8b14c973e4de"/>
     <w:p>
       <w:pPr>
         <w:pStyle w:val="Heading3"/>
       </w:pPr>
       <w:r>
-        <w:t xml:space="preserve">11.9 Sueldos y Libro de Sueldos Digital (ARCA)</w:t>
+        <w:t xml:space="preserve">11.9 Sueldos: motor de liquidación completo (UOM + fuera de convenio + Ganancias + ARCA)</w:t>
       </w:r>
     </w:p>
     <w:p>
@@ -16643,36 +16643,145 @@
         <w:pStyle w:val="FirstParagraph"/>
       </w:pPr>
       <w:r>
-        <w:t xml:space="preserve">El ERP</w:t>
-      </w:r>
-      <w:r>
-        <w:t xml:space="preserve"> </w:t>
-      </w:r>
-      <w:r>
-        <w:rPr>
-          <w:b/>
-          <w:bCs/>
-        </w:rPr>
-        <w:t xml:space="preserve">no liquida sueldos</w:t>
-      </w:r>
-      <w:r>
-        <w:t xml:space="preserve">: registra lo que liquidó la contadora, genera el asiento de devengamiento y arma el archivo del</w:t>
-      </w:r>
-      <w:r>
-        <w:t xml:space="preserve"> </w:t>
-      </w:r>
-      <w:r>
-        <w:rPr>
-          <w:b/>
-          <w:bCs/>
-        </w:rPr>
-        <w:t xml:space="preserve">Libro de Sueldos Digital</w:t>
-      </w:r>
-      <w:r>
-        <w:t xml:space="preserve"> </w:t>
-      </w:r>
-      <w:r>
-        <w:t xml:space="preserve">para subir a ARCA.</w:t>
+        <w:t xml:space="preserve">Desde septiembre de 2026 el ERP</w:t>
+      </w:r>
+      <w:r>
+        <w:t xml:space="preserve"> </w:t>
+      </w:r>
+      <w:r>
+        <w:rPr>
+          <w:b/>
+          <w:bCs/>
+        </w:rPr>
+        <w:t xml:space="preserve">liquida sueldos</w:t>
+      </w:r>
+      <w:r>
+        <w:t xml:space="preserve">: calcula el recibo completo (básico, antigüedad, presentismo, horas extras, feriados, licencias, vacaciones, no remunerativo de paritaria, aportes, Impuesto a las Ganancias 4ª categoría y contribuciones patronales), lo contabiliza y lo imprime. La contadora sigue revisando y confirmando cada liquidación — el sistema no reemplaza su control, se lo simplifica. Planta liquida bajo el convenio</w:t>
+      </w:r>
+      <w:r>
+        <w:t xml:space="preserve"> </w:t>
+      </w:r>
+      <w:r>
+        <w:rPr>
+          <w:b/>
+          <w:bCs/>
+        </w:rPr>
+        <w:t xml:space="preserve">UOM CCT 260/75 rama 17</w:t>
+      </w:r>
+      <w:r>
+        <w:t xml:space="preserve">; administración,</w:t>
+      </w:r>
+      <w:r>
+        <w:t xml:space="preserve"> </w:t>
+      </w:r>
+      <w:r>
+        <w:rPr>
+          <w:b/>
+          <w:bCs/>
+        </w:rPr>
+        <w:t xml:space="preserve">fuera de convenio</w:t>
+      </w:r>
+      <w:r>
+        <w:t xml:space="preserve">.</w:t>
+      </w:r>
+    </w:p>
+    <w:p>
+      <w:pPr>
+        <w:pStyle w:val="BodyText"/>
+      </w:pPr>
+      <w:r>
+        <w:t xml:space="preserve">Antes de liquidar el primer período hay que cargar tres cosas, en este orden:</w:t>
+      </w:r>
+      <w:r>
+        <w:t xml:space="preserve"> </w:t>
+      </w:r>
+      <w:r>
+        <w:rPr>
+          <w:b/>
+          <w:bCs/>
+        </w:rPr>
+        <w:t xml:space="preserve">Escalas y parámetros</w:t>
+      </w:r>
+      <w:r>
+        <w:t xml:space="preserve">, el</w:t>
+      </w:r>
+      <w:r>
+        <w:t xml:space="preserve"> </w:t>
+      </w:r>
+      <w:r>
+        <w:rPr>
+          <w:b/>
+          <w:bCs/>
+        </w:rPr>
+        <w:t xml:space="preserve">legajo</w:t>
+      </w:r>
+      <w:r>
+        <w:t xml:space="preserve"> </w:t>
+      </w:r>
+      <w:r>
+        <w:t xml:space="preserve">de cada empleado y las</w:t>
+      </w:r>
+      <w:r>
+        <w:t xml:space="preserve"> </w:t>
+      </w:r>
+      <w:r>
+        <w:rPr>
+          <w:b/>
+          <w:bCs/>
+        </w:rPr>
+        <w:t xml:space="preserve">novedades</w:t>
+      </w:r>
+      <w:r>
+        <w:t xml:space="preserve"> </w:t>
+      </w:r>
+      <w:r>
+        <w:t xml:space="preserve">del período.</w:t>
+      </w:r>
+    </w:p>
+    <w:bookmarkStart w:id="59" w:name="X59352d794e45ba73ec24f97a1ff6f63202d1261"/>
+    <w:p>
+      <w:pPr>
+        <w:pStyle w:val="Heading4"/>
+      </w:pPr>
+      <w:r>
+        <w:t xml:space="preserve">Escalas y parámetros (Sueldos → Novedades →</w:t>
+      </w:r>
+      <w:r>
+        <w:t xml:space="preserve"> </w:t>
+      </w:r>
+      <w:r>
+        <w:rPr>
+          <w:b/>
+          <w:bCs/>
+        </w:rPr>
+        <w:t xml:space="preserve">Escalas y parámetros</w:t>
+      </w:r>
+      <w:r>
+        <w:t xml:space="preserve">, solo administrador)</w:t>
+      </w:r>
+    </w:p>
+    <w:p>
+      <w:pPr>
+        <w:pStyle w:val="FirstParagraph"/>
+      </w:pPr>
+      <w:r>
+        <w:t xml:space="preserve">Cuatro pestañas, todas con</w:t>
+      </w:r>
+      <w:r>
+        <w:t xml:space="preserve"> </w:t>
+      </w:r>
+      <w:r>
+        <w:rPr>
+          <w:b/>
+          <w:bCs/>
+        </w:rPr>
+        <w:t xml:space="preserve">historial por vigencia</w:t>
+      </w:r>
+      <w:r>
+        <w:t xml:space="preserve"> </w:t>
+      </w:r>
+      <w:r>
+        <w:t xml:space="preserve">(cada cambio se carga con la fecha desde la que rige; el motor usa siempre la vigente al último día del período que estás liquidando):</w:t>
       </w:r>
     </w:p>
     <w:p>
@@ -16688,77 +16797,29 @@
           <w:b/>
           <w:bCs/>
         </w:rPr>
-        <w:t xml:space="preserve">Empleados:</w:t>
-      </w:r>
-      <w:r>
-        <w:t xml:space="preserve"> </w:t>
-      </w:r>
-      <w:r>
-        <w:t xml:space="preserve">un legajo por persona. Además de nombre, CUIL, categoría y centro de costo (fábrica / administración, que define las cuentas de gasto), abrí</w:t>
-      </w:r>
-      <w:r>
-        <w:t xml:space="preserve"> </w:t>
-      </w:r>
-      <w:r>
-        <w:rPr>
-          <w:b/>
-          <w:bCs/>
-        </w:rPr>
-        <w:t xml:space="preserve">Datos ARCA</w:t>
-      </w:r>
-      <w:r>
-        <w:t xml:space="preserve"> </w:t>
-      </w:r>
-      <w:r>
-        <w:t xml:space="preserve">y completá lo que va al F.931:</w:t>
-      </w:r>
-      <w:r>
-        <w:t xml:space="preserve"> </w:t>
-      </w:r>
-      <w:r>
-        <w:rPr>
-          <w:b/>
-          <w:bCs/>
-        </w:rPr>
-        <w:t xml:space="preserve">CBU</w:t>
-      </w:r>
-      <w:r>
-        <w:t xml:space="preserve"> </w:t>
-      </w:r>
-      <w:r>
-        <w:t xml:space="preserve">y forma de pago (la ley exige acreditación bancaria),</w:t>
-      </w:r>
-      <w:r>
-        <w:t xml:space="preserve"> </w:t>
-      </w:r>
-      <w:r>
-        <w:rPr>
-          <w:b/>
-          <w:bCs/>
-        </w:rPr>
-        <w:t xml:space="preserve">código de obra social</w:t>
-      </w:r>
-      <w:r>
-        <w:t xml:space="preserve"> </w:t>
-      </w:r>
-      <w:r>
-        <w:t xml:space="preserve">(RNOS, 6 dígitos),</w:t>
-      </w:r>
-      <w:r>
-        <w:t xml:space="preserve"> </w:t>
-      </w:r>
-      <w:r>
-        <w:rPr>
-          <w:b/>
-          <w:bCs/>
-        </w:rPr>
-        <w:t xml:space="preserve">código de actividad</w:t>
-      </w:r>
-      <w:r>
-        <w:t xml:space="preserve"> </w:t>
-      </w:r>
-      <w:r>
-        <w:t xml:space="preserve">SICOSS (3 dígitos), cónyuge, hijos, marcas CCT / SCVO y los códigos de situación, condición, modalidad (008 = tiempo completo indeterminado), siniestrado, localidad y situación de revista. Los defaults sirven para un operario en relación de dependencia; la contadora confirma cada legajo. Un empleado dado de baja no aparece en liquidaciones nuevas, pero su histórico queda.</w:t>
+        <w:t xml:space="preserve">Escala salarial:</w:t>
+      </w:r>
+      <w:r>
+        <w:t xml:space="preserve"> </w:t>
+      </w:r>
+      <w:r>
+        <w:t xml:space="preserve">valor hora o básico mensual por categoría UOM (Ingresante, Operario, Oficial…) y por categoría mensualizada (Administrativo, Técnico).</w:t>
+      </w:r>
+      <w:r>
+        <w:t xml:space="preserve"> </w:t>
+      </w:r>
+      <w:r>
+        <w:rPr>
+          <w:b/>
+          <w:bCs/>
+        </w:rPr>
+        <w:t xml:space="preserve">+ Nueva vigencia</w:t>
+      </w:r>
+      <w:r>
+        <w:t xml:space="preserve"> </w:t>
+      </w:r>
+      <w:r>
+        <w:t xml:space="preserve">copia la tabla actual a una fecha nueva aplicando un % de aumento parejo. Si una categoría queda en 0, el motor avisa al liquidar a un empleado de esa categoría.</w:t>
       </w:r>
     </w:p>
     <w:p>
@@ -16774,109 +16835,13 @@
           <w:b/>
           <w:bCs/>
         </w:rPr>
-        <w:t xml:space="preserve">Conceptos ARCA (botón en la barra de Sueldos):</w:t>
-      </w:r>
-      <w:r>
-        <w:t xml:space="preserve"> </w:t>
-      </w:r>
-      <w:r>
-        <w:t xml:space="preserve">el catálogo de conceptos del recibo con</w:t>
-      </w:r>
-      <w:r>
-        <w:t xml:space="preserve"> </w:t>
-      </w:r>
-      <w:r>
-        <w:rPr>
-          <w:b/>
-          <w:bCs/>
-        </w:rPr>
-        <w:t xml:space="preserve">tus códigos</w:t>
-      </w:r>
-      <w:r>
-        <w:t xml:space="preserve"> </w:t>
-      </w:r>
-      <w:r>
-        <w:t xml:space="preserve">(100 básico, 130 horas extras, 300 jubilación, 320 obra social…). Son los mismos códigos que la contadora asocia a los conceptos de ARCA en Libro de Sueldos Digital → Conceptos. El</w:t>
-      </w:r>
-      <w:r>
-        <w:t xml:space="preserve"> </w:t>
-      </w:r>
-      <w:r>
-        <w:rPr>
-          <w:b/>
-          <w:bCs/>
-        </w:rPr>
-        <w:t xml:space="preserve">tipo</w:t>
-      </w:r>
-      <w:r>
-        <w:t xml:space="preserve"> </w:t>
-      </w:r>
-      <w:r>
-        <w:t xml:space="preserve">define qué hace cada uno:</w:t>
-      </w:r>
-      <w:r>
-        <w:t xml:space="preserve"> </w:t>
-      </w:r>
-      <w:r>
-        <w:rPr>
-          <w:i/>
-          <w:iCs/>
-        </w:rPr>
-        <w:t xml:space="preserve">remunerativo</w:t>
-      </w:r>
-      <w:r>
-        <w:t xml:space="preserve"> </w:t>
-      </w:r>
-      <w:r>
-        <w:t xml:space="preserve">suma al bruto,</w:t>
-      </w:r>
-      <w:r>
-        <w:t xml:space="preserve"> </w:t>
-      </w:r>
-      <w:r>
-        <w:rPr>
-          <w:i/>
-          <w:iCs/>
-        </w:rPr>
-        <w:t xml:space="preserve">no remunerativo</w:t>
-      </w:r>
-      <w:r>
-        <w:t xml:space="preserve"> </w:t>
-      </w:r>
-      <w:r>
-        <w:t xml:space="preserve">al no remunerativo,</w:t>
-      </w:r>
-      <w:r>
-        <w:t xml:space="preserve"> </w:t>
-      </w:r>
-      <w:r>
-        <w:rPr>
-          <w:i/>
-          <w:iCs/>
-        </w:rPr>
-        <w:t xml:space="preserve">descuento</w:t>
-      </w:r>
-      <w:r>
-        <w:t xml:space="preserve"> </w:t>
-      </w:r>
-      <w:r>
-        <w:t xml:space="preserve">a los aportes,</w:t>
-      </w:r>
-      <w:r>
-        <w:t xml:space="preserve"> </w:t>
-      </w:r>
-      <w:r>
-        <w:rPr>
-          <w:i/>
-          <w:iCs/>
-        </w:rPr>
-        <w:t xml:space="preserve">informativo</w:t>
-      </w:r>
-      <w:r>
-        <w:t xml:space="preserve"> </w:t>
-      </w:r>
-      <w:r>
-        <w:t xml:space="preserve">no suma (asignaciones familiares). Un concepto usado no se borra: se desactiva.</w:t>
+        <w:t xml:space="preserve">Convenio:</w:t>
+      </w:r>
+      <w:r>
+        <w:t xml:space="preserve"> </w:t>
+      </w:r>
+      <w:r>
+        <w:t xml:space="preserve">IMGR (ingreso mínimo garantizado), no remunerativo de paritaria, % de antigüedad, horas del mes y del día, % de presentismo, tolerancia de ausencias, sepelio, seguro de vida colectivo (SCVO), cuota sindical y redondeo del neto.</w:t>
       </w:r>
     </w:p>
     <w:p>
@@ -16892,39 +16857,13 @@
           <w:b/>
           <w:bCs/>
         </w:rPr>
-        <w:t xml:space="preserve">Liquidación:</w:t>
-      </w:r>
-      <w:r>
-        <w:t xml:space="preserve"> </w:t>
-      </w:r>
-      <w:r>
-        <w:rPr>
-          <w:b/>
-          <w:bCs/>
-        </w:rPr>
-        <w:t xml:space="preserve">+ Liquidación</w:t>
-      </w:r>
-      <w:r>
-        <w:t xml:space="preserve"> </w:t>
-      </w:r>
-      <w:r>
-        <w:t xml:space="preserve">→ período (por defecto el mes anterior), tipo (mensual, quincena, SAC, vacaciones, final) y fecha de pago. Por cada empleado cargá los importes del recibo. Los % de arriba (aportes 17, contribuciones 27,35, ART 3) pre-calculan aportes, neto, contribuciones y ART al tipear el bruto; todos los campos son editables para que coincidan con el recibo real.</w:t>
-      </w:r>
-      <w:r>
-        <w:t xml:space="preserve"> </w:t>
-      </w:r>
-      <w:r>
-        <w:rPr>
-          <w:b/>
-          <w:bCs/>
-        </w:rPr>
-        <w:t xml:space="preserve">⏱ Traer horas de planta</w:t>
-      </w:r>
-      <w:r>
-        <w:t xml:space="preserve"> </w:t>
-      </w:r>
-      <w:r>
-        <w:t xml:space="preserve">suma las horas productivas de los timers del mes por operario y sugiere bruto = horas × valor hora.</w:t>
+        <w:t xml:space="preserve">Previsional:</w:t>
+      </w:r>
+      <w:r>
+        <w:t xml:space="preserve"> </w:t>
+      </w:r>
+      <w:r>
+        <w:t xml:space="preserve">topes mínimo y máximo de ANSES, detracción Ley 27.430, porcentajes de aportes (jubilación, INSSJP, obra social, adherentes) y de contribuciones patronales (Dec. 814/01), ART.</w:t>
       </w:r>
     </w:p>
     <w:p>
@@ -16940,369 +16879,21 @@
           <w:b/>
           <w:bCs/>
         </w:rPr>
-        <w:t xml:space="preserve">Botón ARCA de cada fila:</w:t>
-      </w:r>
-      <w:r>
-        <w:t xml:space="preserve"> </w:t>
-      </w:r>
-      <w:r>
-        <w:t xml:space="preserve">ahí van los</w:t>
-      </w:r>
-      <w:r>
-        <w:t xml:space="preserve"> </w:t>
-      </w:r>
-      <w:r>
-        <w:rPr>
-          <w:b/>
-          <w:bCs/>
-        </w:rPr>
-        <w:t xml:space="preserve">conceptos del recibo</w:t>
-      </w:r>
-      <w:r>
-        <w:t xml:space="preserve"> </w:t>
-      </w:r>
-      <w:r>
-        <w:t xml:space="preserve">(código, cantidad, unidades, importe; débito/crédito se deduce del tipo) y las</w:t>
-      </w:r>
-      <w:r>
-        <w:t xml:space="preserve"> </w:t>
-      </w:r>
-      <w:r>
-        <w:rPr>
-          <w:b/>
-          <w:bCs/>
-        </w:rPr>
-        <w:t xml:space="preserve">bases imponibles</w:t>
-      </w:r>
-      <w:r>
-        <w:t xml:space="preserve"> </w:t>
-      </w:r>
-      <w:r>
-        <w:t xml:space="preserve">del F.931. Con conceptos cargados, bruto / no remunerativo / aportes / neto</w:t>
-      </w:r>
-      <w:r>
-        <w:t xml:space="preserve"> </w:t>
-      </w:r>
-      <w:r>
-        <w:rPr>
-          <w:b/>
-          <w:bCs/>
-        </w:rPr>
-        <w:t xml:space="preserve">se calculan desde los conceptos</w:t>
-      </w:r>
-      <w:r>
-        <w:t xml:space="preserve"> </w:t>
-      </w:r>
-      <w:r>
-        <w:t xml:space="preserve">y la fila queda bloqueada (contribuciones y ART siguen a mano: no van al LSD, ARCA los calcula).</w:t>
-      </w:r>
-      <w:r>
-        <w:t xml:space="preserve"> </w:t>
-      </w:r>
-      <w:r>
-        <w:rPr>
-          <w:b/>
-          <w:bCs/>
-        </w:rPr>
-        <w:t xml:space="preserve">Prellenar desde el bruto</w:t>
-      </w:r>
-      <w:r>
-        <w:t xml:space="preserve"> </w:t>
-      </w:r>
-      <w:r>
-        <w:t xml:space="preserve">copia el bruto remunerativo a las bases 1–9 (con el tope de aportes configurado en 1/4/5), pone remuneración bruta = remunerativo + no remunerativo y base 10 = bruto − importe a detraer. Días trabajados (30)</w:t>
-      </w:r>
-      <w:r>
-        <w:t xml:space="preserve"> </w:t>
-      </w:r>
-      <w:r>
-        <w:rPr>
-          <w:b/>
-          <w:bCs/>
-        </w:rPr>
-        <w:t xml:space="preserve">o</w:t>
-      </w:r>
-      <w:r>
-        <w:t xml:space="preserve"> </w:t>
-      </w:r>
-      <w:r>
-        <w:t xml:space="preserve">horas: no ambos.</w:t>
-      </w:r>
-    </w:p>
-    <w:p>
-      <w:pPr>
-        <w:pStyle w:val="Compact"/>
-        <w:numPr>
-          <w:ilvl w:val="0"/>
-          <w:numId w:val="1023"/>
-        </w:numPr>
-      </w:pPr>
-      <w:r>
-        <w:rPr>
-          <w:b/>
-          <w:bCs/>
-        </w:rPr>
-        <w:t xml:space="preserve">Guardar borrador → Confirmar:</w:t>
-      </w:r>
-      <w:r>
-        <w:t xml:space="preserve"> </w:t>
-      </w:r>
-      <w:r>
-        <w:t xml:space="preserve">al confirmar se genera el asiento de devengamiento con fecha fin de mes (gastos por centro al debe; Sueldos a pagar por el neto y Cargas sociales a pagar por aportes + contribuciones + ART al haber). En liquidaciones mensuales o por quincena te pregunta si registrás también la</w:t>
-      </w:r>
-      <w:r>
-        <w:t xml:space="preserve"> </w:t>
-      </w:r>
-      <w:r>
-        <w:rPr>
-          <w:b/>
-          <w:bCs/>
-        </w:rPr>
-        <w:t xml:space="preserve">provisión de SAC</w:t>
-      </w:r>
-      <w:r>
-        <w:t xml:space="preserve"> </w:t>
-      </w:r>
-      <w:r>
-        <w:t xml:space="preserve">(1/12 del bruto); al confirmar un SAC, la provisión acumulada hasta ese mes se consume sola. No se puede cargar dos veces el mismo mes y tipo: editá la existente.</w:t>
-      </w:r>
-    </w:p>
-    <w:p>
-      <w:pPr>
-        <w:pStyle w:val="Compact"/>
-        <w:numPr>
-          <w:ilvl w:val="0"/>
-          <w:numId w:val="1023"/>
-        </w:numPr>
-      </w:pPr>
-      <w:r>
-        <w:rPr>
-          <w:b/>
-          <w:bCs/>
-        </w:rPr>
-        <w:t xml:space="preserve">Pagar netos / Pagar F.931:</w:t>
-      </w:r>
-      <w:r>
-        <w:t xml:space="preserve"> </w:t>
-      </w:r>
-      <w:r>
-        <w:t xml:space="preserve">un asiento contra la cuenta bancaria real por el</w:t>
-      </w:r>
-      <w:r>
-        <w:t xml:space="preserve"> </w:t>
-      </w:r>
-      <w:r>
-        <w:rPr>
-          <w:b/>
-          <w:bCs/>
-        </w:rPr>
-        <w:t xml:space="preserve">importe exacto</w:t>
-      </w:r>
-      <w:r>
-        <w:t xml:space="preserve"> </w:t>
-      </w:r>
-      <w:r>
-        <w:t xml:space="preserve">de la liquidación (Sueldos a pagar o Cargas a pagar contra Banco). Si pagaste otro monto o en dos veces, registralo como asiento manual: el badge PAGADO significa pagado completo y saca la liquidación del cashflow y de la alerta de vencimiento del F.931. Una liquidación con pagos registrados no se puede editar ni eliminar hasta anular esos asientos.</w:t>
-      </w:r>
-    </w:p>
-    <w:p>
-      <w:pPr>
-        <w:pStyle w:val="Compact"/>
-        <w:numPr>
-          <w:ilvl w:val="0"/>
-          <w:numId w:val="1023"/>
-        </w:numPr>
-      </w:pPr>
-      <w:r>
-        <w:rPr>
-          <w:b/>
-          <w:bCs/>
-        </w:rPr>
-        <w:t xml:space="preserve">Anular:</w:t>
-      </w:r>
-      <w:r>
-        <w:t xml:space="preserve"> </w:t>
-      </w:r>
-      <w:r>
-        <w:t xml:space="preserve">una confirmada vuelve a borrador (el asiento queda ANULADO, nunca se borra; motivo obligatorio). Un borrador se elimina.</w:t>
-      </w:r>
-    </w:p>
-    <w:p>
-      <w:pPr>
-        <w:pStyle w:val="Compact"/>
-        <w:numPr>
-          <w:ilvl w:val="0"/>
-          <w:numId w:val="1023"/>
-        </w:numPr>
-      </w:pPr>
-      <w:r>
-        <w:rPr>
-          <w:b/>
-          <w:bCs/>
-        </w:rPr>
-        <w:t xml:space="preserve">LSD (Libro de Sueldos Digital):</w:t>
-      </w:r>
-      <w:r>
-        <w:t xml:space="preserve"> </w:t>
-      </w:r>
-      <w:r>
-        <w:t xml:space="preserve">el botón</w:t>
-      </w:r>
-      <w:r>
-        <w:t xml:space="preserve"> </w:t>
-      </w:r>
-      <w:r>
-        <w:rPr>
-          <w:b/>
-          <w:bCs/>
-        </w:rPr>
-        <w:t xml:space="preserve">LSD</w:t>
-      </w:r>
-      <w:r>
-        <w:t xml:space="preserve"> </w:t>
-      </w:r>
-      <w:r>
-        <w:t xml:space="preserve">de cada liquidación abre el exportador. Completá una vez el</w:t>
-      </w:r>
-      <w:r>
-        <w:t xml:space="preserve"> </w:t>
-      </w:r>
-      <w:r>
-        <w:rPr>
-          <w:b/>
-          <w:bCs/>
-        </w:rPr>
-        <w:t xml:space="preserve">CUIT del empleador</w:t>
-      </w:r>
-      <w:r>
-        <w:t xml:space="preserve">, el tipo de empresa (Dec. 814/01), el importe a detraer (Ley 27.430) y el tope de aportes — quedan guardados. Elegí envío</w:t>
-      </w:r>
-      <w:r>
-        <w:t xml:space="preserve"> </w:t>
-      </w:r>
-      <w:r>
-        <w:rPr>
-          <w:b/>
-          <w:bCs/>
-        </w:rPr>
-        <w:t xml:space="preserve">SJ</w:t>
-      </w:r>
-      <w:r>
-        <w:t xml:space="preserve"> </w:t>
-      </w:r>
-      <w:r>
-        <w:t xml:space="preserve">(liquidación + F.931) o</w:t>
-      </w:r>
-      <w:r>
-        <w:t xml:space="preserve"> </w:t>
-      </w:r>
-      <w:r>
-        <w:rPr>
-          <w:b/>
-          <w:bCs/>
-        </w:rPr>
-        <w:t xml:space="preserve">RE</w:t>
-      </w:r>
-      <w:r>
-        <w:t xml:space="preserve"> </w:t>
-      </w:r>
-      <w:r>
-        <w:t xml:space="preserve">(solo rectifica el F.931), tipo de liquidación,</w:t>
-      </w:r>
-      <w:r>
-        <w:t xml:space="preserve"> </w:t>
-      </w:r>
-      <w:r>
-        <w:rPr>
-          <w:b/>
-          <w:bCs/>
-        </w:rPr>
-        <w:t xml:space="preserve">número de liquidación</w:t>
-      </w:r>
-      <w:r>
-        <w:t xml:space="preserve"> </w:t>
-      </w:r>
-      <w:r>
-        <w:t xml:space="preserve">(mayor a los ya enviados del período; el ERP sugiere el siguiente) y fecha de pago. El preview muestra el archivo línea por línea con su largo y</w:t>
-      </w:r>
-      <w:r>
-        <w:t xml:space="preserve"> </w:t>
-      </w:r>
-      <w:r>
-        <w:rPr>
-          <w:b/>
-          <w:bCs/>
-        </w:rPr>
-        <w:t xml:space="preserve">lista todo lo que ARCA rechazaría</w:t>
-      </w:r>
-      <w:r>
-        <w:t xml:space="preserve"> </w:t>
-      </w:r>
-      <w:r>
-        <w:t xml:space="preserve">(CUIL sin verificador, CBU inválido, empleado sin conceptos, sin obra social o actividad, días y horas a la vez, etc.): hasta que no esté limpio no hay descarga.</w:t>
-      </w:r>
-      <w:r>
-        <w:t xml:space="preserve"> </w:t>
-      </w:r>
-      <w:r>
-        <w:rPr>
-          <w:b/>
-          <w:bCs/>
-        </w:rPr>
-        <w:t xml:space="preserve">Descargar TXT</w:t>
-      </w:r>
-      <w:r>
-        <w:t xml:space="preserve"> </w:t>
-      </w:r>
-      <w:r>
-        <w:t xml:space="preserve">baja</w:t>
-      </w:r>
-      <w:r>
-        <w:t xml:space="preserve"> </w:t>
-      </w:r>
-      <w:r>
-        <w:rPr>
-          <w:rStyle w:val="VerbatimChar"/>
-        </w:rPr>
-        <w:t xml:space="preserve">LSD_AAAAMM_tipo_nro.txt</w:t>
-      </w:r>
-      <w:r>
-        <w:t xml:space="preserve">, guarda el número de liquidación (el botón pasa a</w:t>
-      </w:r>
-      <w:r>
-        <w:t xml:space="preserve"> </w:t>
-      </w:r>
-      <w:r>
-        <w:rPr>
-          <w:b/>
-          <w:bCs/>
-        </w:rPr>
-        <w:t xml:space="preserve">LSD ✓</w:t>
-      </w:r>
-      <w:r>
-        <w:t xml:space="preserve">) y lo subís en ARCA → Libro de Sueldos Digital → Carga de liquidación. Se puede exportar un borrador para validar en ARCA antes de confirmar.</w:t>
-      </w:r>
-    </w:p>
-    <w:p>
-      <w:pPr>
-        <w:pStyle w:val="Compact"/>
-        <w:numPr>
-          <w:ilvl w:val="0"/>
-          <w:numId w:val="1023"/>
-        </w:numPr>
-      </w:pPr>
-      <w:r>
-        <w:rPr>
-          <w:b/>
-          <w:bCs/>
-        </w:rPr>
-        <w:t xml:space="preserve">Alertas:</w:t>
-      </w:r>
-      <w:r>
-        <w:t xml:space="preserve"> </w:t>
-      </w:r>
-      <w:r>
-        <w:t xml:space="preserve">el F.931 vence entre el 7 y el 10 del mes siguiente; el panel</w:t>
+        <w:t xml:space="preserve">Ganancias:</w:t>
+      </w:r>
+      <w:r>
+        <w:t xml:space="preserve"> </w:t>
+      </w:r>
+      <w:r>
+        <w:t xml:space="preserve">las tablas semestrales (enero y julio) con el Ganancia No Imponible, deducción especial, cónyuge, hijo, hijo con discapacidad y los 9 tramos de la escala. Cargá la tabla nueva apenas ARCA publique los valores del semestre.</w:t>
+      </w:r>
+    </w:p>
+    <w:p>
+      <w:pPr>
+        <w:pStyle w:val="FirstParagraph"/>
+      </w:pPr>
+      <w:r>
+        <w:t xml:space="preserve">Estos parámetros son de configuración: sus alertas (categoría sin valor, parámetro vacío) se ven solo al entrar a esta página, no en el panel</w:t>
       </w:r>
       <w:r>
         <w:t xml:space="preserve"> </w:t>
@@ -17311,28 +16902,17 @@
         <w:t xml:space="preserve">“Para hoy”</w:t>
       </w:r>
       <w:r>
-        <w:t xml:space="preserve"> </w:t>
-      </w:r>
-      <w:r>
-        <w:t xml:space="preserve">avisa desde el día 2 y marca vencido pasado el 9 si no registraste el pago de cargas. El cashflow proyectado suma los netos a la fecha de pago y el F.931 al día 9.</w:t>
-      </w:r>
-    </w:p>
-    <w:p>
-      <w:r>
-        <w:pict>
-          <v:rect style="width:0;height:1.5pt" o:hralign="center" o:hrstd="t" o:hr="t"/>
-        </w:pict>
+        <w:t xml:space="preserve">.</w:t>
       </w:r>
     </w:p>
     <w:bookmarkEnd w:id="59"/>
-    <w:bookmarkEnd w:id="60"/>
-    <w:bookmarkStart w:id="64" w:name="configuración"/>
-    <w:p>
-      <w:pPr>
-        <w:pStyle w:val="Heading2"/>
-      </w:pPr>
-      <w:r>
-        <w:t xml:space="preserve">12. Configuración</w:t>
+    <w:bookmarkStart w:id="60" w:name="legajo-del-empleado"/>
+    <w:p>
+      <w:pPr>
+        <w:pStyle w:val="Heading4"/>
+      </w:pPr>
+      <w:r>
+        <w:t xml:space="preserve">Legajo del empleado</w:t>
       </w:r>
     </w:p>
     <w:p>
@@ -17340,121 +16920,7 @@
         <w:pStyle w:val="FirstParagraph"/>
       </w:pPr>
       <w:r>
-        <w:t xml:space="preserve">Tres pestañas. Las dos últimas son</w:t>
-      </w:r>
-      <w:r>
-        <w:t xml:space="preserve"> </w:t>
-      </w:r>
-      <w:r>
-        <w:rPr>
-          <w:b/>
-          <w:bCs/>
-        </w:rPr>
-        <w:t xml:space="preserve">solo para el administrador</w:t>
-      </w:r>
-      <w:r>
-        <w:t xml:space="preserve">.</w:t>
-      </w:r>
-    </w:p>
-    <w:bookmarkStart w:id="61" w:name="materiales"/>
-    <w:p>
-      <w:pPr>
-        <w:pStyle w:val="Heading3"/>
-      </w:pPr>
-      <w:r>
-        <w:t xml:space="preserve">12.1 Materiales</w:t>
-      </w:r>
-    </w:p>
-    <w:p>
-      <w:pPr>
-        <w:pStyle w:val="FirstParagraph"/>
-      </w:pPr>
-      <w:r>
-        <w:t xml:space="preserve">El catálogo de tipos de acero / normas que después elegís en barras y certificados.</w:t>
-      </w:r>
-      <w:r>
-        <w:t xml:space="preserve"> </w:t>
-      </w:r>
-      <w:r>
-        <w:rPr>
-          <w:b/>
-          <w:bCs/>
-        </w:rPr>
-        <w:t xml:space="preserve">+ Nuevo material</w:t>
-      </w:r>
-      <w:r>
-        <w:t xml:space="preserve"> </w:t>
-      </w:r>
-      <w:r>
-        <w:t xml:space="preserve">→</w:t>
-      </w:r>
-      <w:r>
-        <w:t xml:space="preserve"> </w:t>
-      </w:r>
-      <w:r>
-        <w:rPr>
-          <w:b/>
-          <w:bCs/>
-        </w:rPr>
-        <w:t xml:space="preserve">Material / Norma</w:t>
-      </w:r>
-      <w:r>
-        <w:t xml:space="preserve"> </w:t>
-      </w:r>
-      <w:r>
-        <w:t xml:space="preserve">*,</w:t>
-      </w:r>
-      <w:r>
-        <w:t xml:space="preserve"> </w:t>
-      </w:r>
-      <w:r>
-        <w:rPr>
-          <w:b/>
-          <w:bCs/>
-        </w:rPr>
-        <w:t xml:space="preserve">Descripción</w:t>
-      </w:r>
-      <w:r>
-        <w:t xml:space="preserve">,</w:t>
-      </w:r>
-      <w:r>
-        <w:t xml:space="preserve"> </w:t>
-      </w:r>
-      <w:r>
-        <w:rPr>
-          <w:b/>
-          <w:bCs/>
-        </w:rPr>
-        <w:t xml:space="preserve">Orden</w:t>
-      </w:r>
-      <w:r>
-        <w:t xml:space="preserve">,</w:t>
-      </w:r>
-      <w:r>
-        <w:t xml:space="preserve"> </w:t>
-      </w:r>
-      <w:r>
-        <w:rPr>
-          <w:b/>
-          <w:bCs/>
-        </w:rPr>
-        <w:t xml:space="preserve">Estado</w:t>
-      </w:r>
-      <w:r>
-        <w:t xml:space="preserve"> </w:t>
-      </w:r>
-      <w:r>
-        <w:t xml:space="preserve">(activo / inactivo).</w:t>
-      </w:r>
-    </w:p>
-    <w:bookmarkEnd w:id="61"/>
-    <w:bookmarkStart w:id="62" w:name="usuarios-y-permisos-admin"/>
-    <w:p>
-      <w:pPr>
-        <w:pStyle w:val="Heading3"/>
-      </w:pPr>
-      <w:r>
-        <w:t xml:space="preserve">12.2 Usuarios y permisos (admin)</w:t>
+        <w:t xml:space="preserve">El modal de empleado tiene cinco pestañas:</w:t>
       </w:r>
     </w:p>
     <w:p>
@@ -17466,23 +16932,26 @@
         </w:numPr>
       </w:pPr>
       <w:r>
-        <w:t xml:space="preserve">Ves y podés</w:t>
-      </w:r>
-      <w:r>
-        <w:t xml:space="preserve"> </w:t>
-      </w:r>
-      <w:r>
-        <w:rPr>
-          <w:b/>
-          <w:bCs/>
-        </w:rPr>
-        <w:t xml:space="preserve">cambiar el código de empresa</w:t>
-      </w:r>
-      <w:r>
-        <w:t xml:space="preserve"> </w:t>
-      </w:r>
-      <w:r>
-        <w:t xml:space="preserve">(el que usan los nuevos para unirse).</w:t>
+        <w:rPr>
+          <w:b/>
+          <w:bCs/>
+        </w:rPr>
+        <w:t xml:space="preserve">Datos:</w:t>
+      </w:r>
+      <w:r>
+        <w:t xml:space="preserve"> </w:t>
+      </w:r>
+      <w:r>
+        <w:t xml:space="preserve">legajo, nombre, CUIL, centro de costo, modalidad (jornal / mensualizado), fecha de ingreso, categoría, obra social, nombre tal como figura en las órdenes de producción (para</w:t>
+      </w:r>
+      <w:r>
+        <w:t xml:space="preserve"> </w:t>
+      </w:r>
+      <w:r>
+        <w:t xml:space="preserve">“Traer horas de planta”</w:t>
+      </w:r>
+      <w:r>
+        <w:t xml:space="preserve">), tarea, contratación, lugar de pago, banco.</w:t>
       </w:r>
     </w:p>
     <w:p>
@@ -17494,83 +16963,149 @@
         </w:numPr>
       </w:pPr>
       <w:r>
-        <w:t xml:space="preserve">Listás usuarios, editás su</w:t>
-      </w:r>
-      <w:r>
-        <w:t xml:space="preserve"> </w:t>
-      </w:r>
-      <w:r>
-        <w:rPr>
-          <w:b/>
-          <w:bCs/>
-        </w:rPr>
-        <w:t xml:space="preserve">rol</w:t>
-      </w:r>
-      <w:r>
-        <w:t xml:space="preserve"> </w:t>
-      </w:r>
-      <w:r>
-        <w:t xml:space="preserve">y</w:t>
-      </w:r>
-      <w:r>
-        <w:t xml:space="preserve"> </w:t>
-      </w:r>
-      <w:r>
-        <w:rPr>
-          <w:b/>
-          <w:bCs/>
-        </w:rPr>
-        <w:t xml:space="preserve">habilitás/deshabilitás módulos</w:t>
-      </w:r>
-      <w:r>
-        <w:t xml:space="preserve"> </w:t>
-      </w:r>
-      <w:r>
-        <w:t xml:space="preserve">por usuario. La lista cubre todos los módulos del sistema (inventario, producción, compras, ventas, calidad, análisis y contabilidad).</w:t>
-      </w:r>
-    </w:p>
-    <w:p>
-      <w:pPr>
-        <w:pStyle w:val="BlockText"/>
-      </w:pPr>
-      <w:r>
-        <w:rPr>
-          <w:b/>
-          <w:bCs/>
-        </w:rPr>
-        <w:t xml:space="preserve">Nota técnica:</w:t>
-      </w:r>
-      <w:r>
-        <w:t xml:space="preserve"> </w:t>
-      </w:r>
-      <w:r>
-        <w:t xml:space="preserve">los permisos por módulo hoy son</w:t>
-      </w:r>
-      <w:r>
-        <w:t xml:space="preserve"> </w:t>
-      </w:r>
-      <w:r>
-        <w:rPr>
-          <w:b/>
-          <w:bCs/>
-        </w:rPr>
-        <w:t xml:space="preserve">visuales</w:t>
-      </w:r>
-      <w:r>
-        <w:t xml:space="preserve"> </w:t>
-      </w:r>
-      <w:r>
-        <w:t xml:space="preserve">(esconden secciones del menú). No los uses como barrera de seguridad fuerte.</w:t>
-      </w:r>
-    </w:p>
-    <w:bookmarkEnd w:id="62"/>
-    <w:bookmarkStart w:id="63" w:name="imputación-contable"/>
-    <w:p>
-      <w:pPr>
-        <w:pStyle w:val="Heading3"/>
-      </w:pPr>
-      <w:r>
-        <w:t xml:space="preserve">12.3 Imputación contable</w:t>
+        <w:rPr>
+          <w:b/>
+          <w:bCs/>
+        </w:rPr>
+        <w:t xml:space="preserve">Remuneración:</w:t>
+      </w:r>
+      <w:r>
+        <w:t xml:space="preserve"> </w:t>
+      </w:r>
+      <w:r>
+        <w:rPr>
+          <w:b/>
+          <w:bCs/>
+        </w:rPr>
+        <w:t xml:space="preserve">convenio</w:t>
+      </w:r>
+      <w:r>
+        <w:t xml:space="preserve"> </w:t>
+      </w:r>
+      <w:r>
+        <w:t xml:space="preserve">(UOM o fuera de convenio — cambia qué campos siguen),</w:t>
+      </w:r>
+      <w:r>
+        <w:t xml:space="preserve"> </w:t>
+      </w:r>
+      <w:r>
+        <w:rPr>
+          <w:b/>
+          <w:bCs/>
+        </w:rPr>
+        <w:t xml:space="preserve">categoría de la escala salarial</w:t>
+      </w:r>
+      <w:r>
+        <w:t xml:space="preserve"> </w:t>
+      </w:r>
+      <w:r>
+        <w:t xml:space="preserve">(UOM) o</w:t>
+      </w:r>
+      <w:r>
+        <w:t xml:space="preserve"> </w:t>
+      </w:r>
+      <w:r>
+        <w:rPr>
+          <w:b/>
+          <w:bCs/>
+        </w:rPr>
+        <w:t xml:space="preserve">sueldo pactado</w:t>
+      </w:r>
+      <w:r>
+        <w:t xml:space="preserve"> </w:t>
+      </w:r>
+      <w:r>
+        <w:t xml:space="preserve">(fuera de convenio), horas semanales, % de antigüedad (solo fuera de convenio; en UOM lo define el convenio), fecha de ingreso reconocida (si difiere de la real, para antigüedad de otro empleador), afiliado al sindicato, cobra presentismo.</w:t>
+      </w:r>
+    </w:p>
+    <w:p>
+      <w:pPr>
+        <w:pStyle w:val="Compact"/>
+        <w:numPr>
+          <w:ilvl w:val="0"/>
+          <w:numId w:val="1024"/>
+        </w:numPr>
+      </w:pPr>
+      <w:r>
+        <w:rPr>
+          <w:b/>
+          <w:bCs/>
+        </w:rPr>
+        <w:t xml:space="preserve">Conceptos fijos:</w:t>
+      </w:r>
+      <w:r>
+        <w:t xml:space="preserve"> </w:t>
+      </w:r>
+      <w:r>
+        <w:t xml:space="preserve">adicionales fijos que se pagan todos los meses (% del básico o importe, ej. tarea peligrosa, título) y conceptos recurrentes con vigencia y cuotas (préstamos, cuotas de cualquier tipo) — cada cuota liquidada avanza sola el contador de</w:t>
+      </w:r>
+      <w:r>
+        <w:t xml:space="preserve"> </w:t>
+      </w:r>
+      <w:r>
+        <w:t xml:space="preserve">“pagas”</w:t>
+      </w:r>
+      <w:r>
+        <w:t xml:space="preserve"> </w:t>
+      </w:r>
+      <w:r>
+        <w:t xml:space="preserve">al confirmar.</w:t>
+      </w:r>
+    </w:p>
+    <w:p>
+      <w:pPr>
+        <w:pStyle w:val="Compact"/>
+        <w:numPr>
+          <w:ilvl w:val="0"/>
+          <w:numId w:val="1024"/>
+        </w:numPr>
+      </w:pPr>
+      <w:r>
+        <w:rPr>
+          <w:b/>
+          <w:bCs/>
+        </w:rPr>
+        <w:t xml:space="preserve">Ganancias:</w:t>
+      </w:r>
+      <w:r>
+        <w:t xml:space="preserve"> </w:t>
+      </w:r>
+      <w:r>
+        <w:t xml:space="preserve">tildá</w:t>
+      </w:r>
+      <w:r>
+        <w:t xml:space="preserve"> </w:t>
+      </w:r>
+      <w:r>
+        <w:t xml:space="preserve">“Se retiene Impuesto a las Ganancias”</w:t>
+      </w:r>
+      <w:r>
+        <w:t xml:space="preserve"> </w:t>
+      </w:r>
+      <w:r>
+        <w:t xml:space="preserve">solo para los empleados alcanzados (4ª categoría); hijos con discapacidad; y la lista de deducciones informadas por F.572 web (alquiler, servicio doméstico, cuota médica, seguro de vida, intereses hipotecarios, donaciones, gastos educativos) con el importe mensual y el período de vigencia.</w:t>
+      </w:r>
+    </w:p>
+    <w:p>
+      <w:pPr>
+        <w:pStyle w:val="Compact"/>
+        <w:numPr>
+          <w:ilvl w:val="0"/>
+          <w:numId w:val="1024"/>
+        </w:numPr>
+      </w:pPr>
+      <w:r>
+        <w:rPr>
+          <w:b/>
+          <w:bCs/>
+        </w:rPr>
+        <w:t xml:space="preserve">ARCA:</w:t>
+      </w:r>
+      <w:r>
+        <w:t xml:space="preserve"> </w:t>
+      </w:r>
+      <w:r>
+        <w:t xml:space="preserve">los datos del F.931/LSD que ya existían (CBU, forma de pago, obra social, cónyuge, hijos, marcas, códigos de situación/condición/actividad/modalidad).</w:t>
       </w:r>
     </w:p>
     <w:p>
@@ -17582,13 +17117,159 @@
           <w:b/>
           <w:bCs/>
         </w:rPr>
-        <w:t xml:space="preserve">Clave para que los asientos automáticos funcionen.</w:t>
-      </w:r>
-      <w:r>
-        <w:t xml:space="preserve"> </w:t>
-      </w:r>
-      <w:r>
-        <w:t xml:space="preserve">Acá decís qué cuenta contable usar para cada tipo de operación:</w:t>
+        <w:t xml:space="preserve">Baja de empleado</w:t>
+      </w:r>
+      <w:r>
+        <w:t xml:space="preserve"> </w:t>
+      </w:r>
+      <w:r>
+        <w:t xml:space="preserve">(botón en el legajo, oculto si ya está dado de baja): fecha de egreso, causa (renuncia, despido sin causa, despido con causa, mutuo acuerdo, fin de contrato, fallecimiento), si hubo preaviso otorgado, tope indemnizatorio del CCT (se precarga desde Configuración) y días de vacaciones ya gozadas en el año. El preview muestra los renglones que va a generar (proporcionales del mes, SAC proporcional, vacaciones no gozadas y, si corresponde, indemnización por antigüedad + preaviso + integración del mes) antes de crear la liquidación de tipo</w:t>
+      </w:r>
+      <w:r>
+        <w:t xml:space="preserve"> </w:t>
+      </w:r>
+      <w:r>
+        <w:rPr>
+          <w:b/>
+          <w:bCs/>
+        </w:rPr>
+        <w:t xml:space="preserve">final</w:t>
+      </w:r>
+      <w:r>
+        <w:t xml:space="preserve"> </w:t>
+      </w:r>
+      <w:r>
+        <w:t xml:space="preserve">en borrador. El empleado no queda dado de baja hasta que confirmás esa liquidación.</w:t>
+      </w:r>
+    </w:p>
+    <w:bookmarkEnd w:id="60"/>
+    <w:bookmarkStart w:id="61" w:name="novedades-por-período-sueldos-novedades"/>
+    <w:p>
+      <w:pPr>
+        <w:pStyle w:val="Heading4"/>
+      </w:pPr>
+      <w:r>
+        <w:t xml:space="preserve">Novedades por período (Sueldos →</w:t>
+      </w:r>
+      <w:r>
+        <w:t xml:space="preserve"> </w:t>
+      </w:r>
+      <w:r>
+        <w:rPr>
+          <w:b/>
+          <w:bCs/>
+        </w:rPr>
+        <w:t xml:space="preserve">Novedades</w:t>
+      </w:r>
+      <w:r>
+        <w:t xml:space="preserve">)</w:t>
+      </w:r>
+    </w:p>
+    <w:p>
+      <w:pPr>
+        <w:pStyle w:val="FirstParagraph"/>
+      </w:pPr>
+      <w:r>
+        <w:t xml:space="preserve">Elegí período y tipo (mensual / 1ª quincena / 2ª quincena) y completá, por empleado, días trabajados, horas normales (jornales), horas extras al 50 % y al 100 %, feriados no trabajados y trabajados, ausencias injustificadas, días de enfermedad, accidente y licencia paga (con su tipo), días sin goce de sueldo, días de vacaciones, adelanto, premio por producción y observaciones. Sin fila cargada, el motor asume el período completo sin novedades.</w:t>
+      </w:r>
+    </w:p>
+    <w:p>
+      <w:pPr>
+        <w:pStyle w:val="BodyText"/>
+      </w:pPr>
+      <w:r>
+        <w:rPr>
+          <w:b/>
+          <w:bCs/>
+        </w:rPr>
+        <w:t xml:space="preserve">⏱ Precargar horas de planta</w:t>
+      </w:r>
+      <w:r>
+        <w:t xml:space="preserve"> </w:t>
+      </w:r>
+      <w:r>
+        <w:t xml:space="preserve">suma las horas productivas de los timers de Modo Planta del período (por la orden asignada al operario, vía el nombre cargado en el legajo) y las pone en</w:t>
+      </w:r>
+      <w:r>
+        <w:t xml:space="preserve"> </w:t>
+      </w:r>
+      <w:r>
+        <w:t xml:space="preserve">“Horas norm.”</w:t>
+      </w:r>
+      <w:r>
+        <w:t xml:space="preserve"> </w:t>
+      </w:r>
+      <w:r>
+        <w:t xml:space="preserve">de los jornales que la tengan vacía — no pisa lo que ya escribiste. Importante: los días de enfermedad, accidente o licencia paga van en sus propias columnas,</w:t>
+      </w:r>
+      <w:r>
+        <w:t xml:space="preserve"> </w:t>
+      </w:r>
+      <w:r>
+        <w:rPr>
+          <w:b/>
+          <w:bCs/>
+        </w:rPr>
+        <w:t xml:space="preserve">no</w:t>
+      </w:r>
+      <w:r>
+        <w:t xml:space="preserve"> </w:t>
+      </w:r>
+      <w:r>
+        <w:t xml:space="preserve">los sumes en</w:t>
+      </w:r>
+      <w:r>
+        <w:t xml:space="preserve"> </w:t>
+      </w:r>
+      <w:r>
+        <w:t xml:space="preserve">“Horas norm.”</w:t>
+      </w:r>
+      <w:r>
+        <w:t xml:space="preserve">: el motor de liquidación los computa aparte.</w:t>
+      </w:r>
+    </w:p>
+    <w:bookmarkEnd w:id="61"/>
+    <w:bookmarkStart w:id="62" w:name="liquidar-con-calcular"/>
+    <w:p>
+      <w:pPr>
+        <w:pStyle w:val="Heading4"/>
+      </w:pPr>
+      <w:r>
+        <w:t xml:space="preserve">Liquidar con Calcular</w:t>
+      </w:r>
+    </w:p>
+    <w:p>
+      <w:pPr>
+        <w:pStyle w:val="FirstParagraph"/>
+      </w:pPr>
+      <w:r>
+        <w:t xml:space="preserve">En la liquidación (Sueldos →</w:t>
+      </w:r>
+      <w:r>
+        <w:t xml:space="preserve"> </w:t>
+      </w:r>
+      <w:r>
+        <w:rPr>
+          <w:b/>
+          <w:bCs/>
+        </w:rPr>
+        <w:t xml:space="preserve">+ Liquidación</w:t>
+      </w:r>
+      <w:r>
+        <w:t xml:space="preserve">, período/tipo/fecha de pago como antes) apareció el botón</w:t>
+      </w:r>
+      <w:r>
+        <w:t xml:space="preserve"> </w:t>
+      </w:r>
+      <w:r>
+        <w:rPr>
+          <w:b/>
+          <w:bCs/>
+        </w:rPr>
+        <w:t xml:space="preserve">⚙ Calcular</w:t>
+      </w:r>
+      <w:r>
+        <w:t xml:space="preserve">: corre el motor para todos los empleados activos, usando la escala, el convenio, los parámetros previsionales, la tabla de Ganancias vigente y las novedades cargadas. Genera automáticamente el básico, antigüedad, presentismo, horas extras, feriados, licencias, vacaciones, el complemento IMGR, el no remunerativo de paritaria, los conceptos fijos y recurrentes del legajo, aportes con topes, sindicales, contribuciones y — si el empleado está marcado — la retención de Ganancias.</w:t>
       </w:r>
     </w:p>
     <w:p>
@@ -17600,62 +17281,50 @@
         </w:numPr>
       </w:pPr>
       <w:r>
-        <w:rPr>
-          <w:b/>
-          <w:bCs/>
-        </w:rPr>
-        <w:t xml:space="preserve">Ventas:</w:t>
-      </w:r>
-      <w:r>
-        <w:t xml:space="preserve"> </w:t>
-      </w:r>
-      <w:r>
-        <w:t xml:space="preserve">cuenta de venta, deudores por ventas, IVA débito fiscal,</w:t>
-      </w:r>
-      <w:r>
-        <w:t xml:space="preserve"> </w:t>
-      </w:r>
-      <w:r>
-        <w:rPr>
-          <w:b/>
-          <w:bCs/>
-        </w:rPr>
-        <w:t xml:space="preserve">alícuota de IVA</w:t>
-      </w:r>
-      <w:r>
-        <w:t xml:space="preserve"> </w:t>
-      </w:r>
-      <w:r>
-        <w:t xml:space="preserve">(21% por defecto), si los precios</w:t>
-      </w:r>
-      <w:r>
-        <w:t xml:space="preserve"> </w:t>
-      </w:r>
-      <w:r>
-        <w:rPr>
-          <w:b/>
-          <w:bCs/>
-        </w:rPr>
-        <w:t xml:space="preserve">incluyen IVA</w:t>
-      </w:r>
-      <w:r>
-        <w:t xml:space="preserve">, y el</w:t>
-      </w:r>
-      <w:r>
-        <w:t xml:space="preserve"> </w:t>
-      </w:r>
-      <w:r>
-        <w:rPr>
-          <w:b/>
-          <w:bCs/>
-        </w:rPr>
-        <w:t xml:space="preserve">punto de venta AFIP</w:t>
-      </w:r>
-      <w:r>
-        <w:t xml:space="preserve"> </w:t>
-      </w:r>
-      <w:r>
-        <w:t xml:space="preserve">para la facturación electrónica.</w:t>
+        <w:t xml:space="preserve">Cada renglón generado por el motor queda con</w:t>
+      </w:r>
+      <w:r>
+        <w:t xml:space="preserve"> </w:t>
+      </w:r>
+      <w:r>
+        <w:rPr>
+          <w:b/>
+          <w:bCs/>
+        </w:rPr>
+        <w:t xml:space="preserve">origen</w:t>
+      </w:r>
+      <w:r>
+        <w:rPr>
+          <w:b/>
+          <w:bCs/>
+        </w:rPr>
+        <w:t xml:space="preserve"> </w:t>
+      </w:r>
+      <w:r>
+        <w:rPr>
+          <w:b/>
+          <w:bCs/>
+        </w:rPr>
+        <w:t xml:space="preserve">“auto”</w:t>
+      </w:r>
+      <w:r>
+        <w:t xml:space="preserve">; si editás un renglón a mano, pasa a</w:t>
+      </w:r>
+      <w:r>
+        <w:t xml:space="preserve"> </w:t>
+      </w:r>
+      <w:r>
+        <w:rPr>
+          <w:b/>
+          <w:bCs/>
+        </w:rPr>
+        <w:t xml:space="preserve">“manual”</w:t>
+      </w:r>
+      <w:r>
+        <w:t xml:space="preserve"> </w:t>
+      </w:r>
+      <w:r>
+        <w:t xml:space="preserve">y Calcular no lo vuelve a tocar (así podés corregir un caso puntual sin perder el resto del cálculo).</w:t>
       </w:r>
     </w:p>
     <w:p>
@@ -17667,33 +17336,28 @@
         </w:numPr>
       </w:pPr>
       <w:r>
-        <w:rPr>
-          <w:b/>
-          <w:bCs/>
-        </w:rPr>
-        <w:t xml:space="preserve">Compras:</w:t>
-      </w:r>
-      <w:r>
-        <w:t xml:space="preserve"> </w:t>
-      </w:r>
-      <w:r>
-        <w:t xml:space="preserve">IVA crédito fiscal, proveedores, compra de materia prima / insumos / herramientas, servicios de terceros, y la cuenta puente</w:t>
-      </w:r>
-      <w:r>
-        <w:t xml:space="preserve"> </w:t>
-      </w:r>
-      <w:r>
-        <w:rPr>
-          <w:b/>
-          <w:bCs/>
-        </w:rPr>
-        <w:t xml:space="preserve">GR/IR</w:t>
-      </w:r>
-      <w:r>
-        <w:t xml:space="preserve"> </w:t>
-      </w:r>
-      <w:r>
-        <w:t xml:space="preserve">(facturas a recibir).</w:t>
+        <w:t xml:space="preserve">En el detalle de cada empleado, el ícono de traza junto a cada concepto muestra la fórmula exacta que usó el motor (por ejemplo</w:t>
+      </w:r>
+      <w:r>
+        <w:t xml:space="preserve"> </w:t>
+      </w:r>
+      <w:r>
+        <w:t xml:space="preserve">“4.485,97 × 90 h”</w:t>
+      </w:r>
+      <w:r>
+        <w:t xml:space="preserve"> </w:t>
+      </w:r>
+      <w:r>
+        <w:t xml:space="preserve">o</w:t>
+      </w:r>
+      <w:r>
+        <w:t xml:space="preserve"> </w:t>
+      </w:r>
+      <w:r>
+        <w:t xml:space="preserve">“básico × 1 % × 3 años”</w:t>
+      </w:r>
+      <w:r>
+        <w:t xml:space="preserve">).</w:t>
       </w:r>
     </w:p>
     <w:p>
@@ -17709,45 +17373,13 @@
           <w:b/>
           <w:bCs/>
         </w:rPr>
-        <w:t xml:space="preserve">Caja y banco:</w:t>
-      </w:r>
-      <w:r>
-        <w:t xml:space="preserve"> </w:t>
-      </w:r>
-      <w:r>
-        <w:t xml:space="preserve">cuenta de caja (efectivo), cuenta de banco (transferencias),</w:t>
-      </w:r>
-      <w:r>
-        <w:t xml:space="preserve"> </w:t>
-      </w:r>
-      <w:r>
-        <w:rPr>
-          <w:b/>
-          <w:bCs/>
-        </w:rPr>
-        <w:t xml:space="preserve">cheques en cartera</w:t>
-      </w:r>
-      <w:r>
-        <w:t xml:space="preserve"> </w:t>
-      </w:r>
-      <w:r>
-        <w:t xml:space="preserve">(recibidos) y</w:t>
-      </w:r>
-      <w:r>
-        <w:t xml:space="preserve"> </w:t>
-      </w:r>
-      <w:r>
-        <w:rPr>
-          <w:b/>
-          <w:bCs/>
-        </w:rPr>
-        <w:t xml:space="preserve">cheques emitidos</w:t>
-      </w:r>
-      <w:r>
-        <w:t xml:space="preserve"> </w:t>
-      </w:r>
-      <w:r>
-        <w:t xml:space="preserve">(a pagar).</w:t>
+        <w:t xml:space="preserve">↺ Recalcular</w:t>
+      </w:r>
+      <w:r>
+        <w:t xml:space="preserve"> </w:t>
+      </w:r>
+      <w:r>
+        <w:t xml:space="preserve">(por empleado) descarta también los renglones manuales y vuelve a correr el motor de cero para ese empleado.</w:t>
       </w:r>
     </w:p>
     <w:p>
@@ -17759,17 +17391,39 @@
         </w:numPr>
       </w:pPr>
       <w:r>
-        <w:rPr>
-          <w:b/>
-          <w:bCs/>
-        </w:rPr>
-        <w:t xml:space="preserve">Retenciones sufridas:</w:t>
-      </w:r>
-      <w:r>
-        <w:t xml:space="preserve"> </w:t>
-      </w:r>
-      <w:r>
-        <w:t xml:space="preserve">las cuentas de crédito fiscal donde van las retenciones que te aplican los clientes (Ganancias, IIBB, SUSS, IVA). Vienen preconfiguradas con las cuentas del plan de Vitalmet.</w:t>
+        <w:t xml:space="preserve">Volver a apretar</w:t>
+      </w:r>
+      <w:r>
+        <w:t xml:space="preserve"> </w:t>
+      </w:r>
+      <w:r>
+        <w:rPr>
+          <w:b/>
+          <w:bCs/>
+        </w:rPr>
+        <w:t xml:space="preserve">⚙ Calcular</w:t>
+      </w:r>
+      <w:r>
+        <w:t xml:space="preserve"> </w:t>
+      </w:r>
+      <w:r>
+        <w:t xml:space="preserve">para todos conserva los renglones manuales cuyo código el motor no genera en esa corrida (para no duplicar), pero</w:t>
+      </w:r>
+      <w:r>
+        <w:t xml:space="preserve"> </w:t>
+      </w:r>
+      <w:r>
+        <w:rPr>
+          <w:b/>
+          <w:bCs/>
+        </w:rPr>
+        <w:t xml:space="preserve">si el código coincide con uno que el motor sí calcula, el renglón manual se pisa</w:t>
+      </w:r>
+      <w:r>
+        <w:t xml:space="preserve"> </w:t>
+      </w:r>
+      <w:r>
+        <w:t xml:space="preserve">— si necesitás mantener ese ajuste, volvé a cargarlo después de Calcular.</w:t>
       </w:r>
     </w:p>
     <w:p>
@@ -17781,33 +17435,324 @@
         </w:numPr>
       </w:pPr>
       <w:r>
-        <w:rPr>
-          <w:b/>
-          <w:bCs/>
-        </w:rPr>
-        <w:t xml:space="preserve">Stock y ajustes de inventario:</w:t>
-      </w:r>
-      <w:r>
-        <w:t xml:space="preserve"> </w:t>
-      </w:r>
-      <w:r>
-        <w:t xml:space="preserve">las cuentas de stock (materia prima, producto terminado, insumos) y la cuenta de resultado</w:t>
-      </w:r>
-      <w:r>
-        <w:t xml:space="preserve"> </w:t>
-      </w:r>
-      <w:r>
-        <w:rPr>
-          <w:b/>
-          <w:bCs/>
-        </w:rPr>
-        <w:t xml:space="preserve">AJUSTES DE INVENTARIO</w:t>
-      </w:r>
-      <w:r>
-        <w:t xml:space="preserve"> </w:t>
-      </w:r>
-      <w:r>
-        <w:t xml:space="preserve">contra la que se asientan las diferencias de ajustes y conteos físicos. Vienen preconfiguradas (114002 / 114001 / 114003 / 421099).</w:t>
+        <w:t xml:space="preserve">El botón te avisa con alertas (no bloquean el guardado) cuando falta un valor de escala, un empleado no tiene fecha de ingreso, no hay novedad cargada, se superó un tope, se perdió el presentismo por ausencias, un préstamo llegó a la última cuota, etc.</w:t>
+      </w:r>
+    </w:p>
+    <w:p>
+      <w:pPr>
+        <w:pStyle w:val="FirstParagraph"/>
+      </w:pPr>
+      <w:r>
+        <w:rPr>
+          <w:b/>
+          <w:bCs/>
+        </w:rPr>
+        <w:t xml:space="preserve">SAC</w:t>
+      </w:r>
+      <w:r>
+        <w:t xml:space="preserve"> </w:t>
+      </w:r>
+      <w:r>
+        <w:t xml:space="preserve">(tipo de liquidación</w:t>
+      </w:r>
+      <w:r>
+        <w:t xml:space="preserve"> </w:t>
+      </w:r>
+      <w:r>
+        <w:t xml:space="preserve">“SAC”</w:t>
+      </w:r>
+      <w:r>
+        <w:t xml:space="preserve">, período 06 o 12): calcula el aguinaldo sobre la mejor remuneración del semestre (completo o proporcional si el empleado ingresó en el semestre) — a diferencia de una liquidación mensual,</w:t>
+      </w:r>
+      <w:r>
+        <w:t xml:space="preserve"> </w:t>
+      </w:r>
+      <w:r>
+        <w:rPr>
+          <w:b/>
+          <w:bCs/>
+        </w:rPr>
+        <w:t xml:space="preserve">no vuelve a sumar el sueldo del mes</w:t>
+      </w:r>
+      <w:r>
+        <w:t xml:space="preserve">, solo el aguinaldo y lo que corresponde sobre él (aportes, contribuciones, Ganancias).</w:t>
+      </w:r>
+    </w:p>
+    <w:p>
+      <w:pPr>
+        <w:pStyle w:val="BodyText"/>
+      </w:pPr>
+      <w:r>
+        <w:rPr>
+          <w:b/>
+          <w:bCs/>
+        </w:rPr>
+        <w:t xml:space="preserve">Liquidación final:</w:t>
+      </w:r>
+      <w:r>
+        <w:t xml:space="preserve"> </w:t>
+      </w:r>
+      <w:r>
+        <w:t xml:space="preserve">se genera desde el botón</w:t>
+      </w:r>
+      <w:r>
+        <w:t xml:space="preserve"> </w:t>
+      </w:r>
+      <w:r>
+        <w:rPr>
+          <w:b/>
+          <w:bCs/>
+        </w:rPr>
+        <w:t xml:space="preserve">Baja</w:t>
+      </w:r>
+      <w:r>
+        <w:t xml:space="preserve"> </w:t>
+      </w:r>
+      <w:r>
+        <w:t xml:space="preserve">del legajo (ver arriba), no desde</w:t>
+      </w:r>
+      <w:r>
+        <w:t xml:space="preserve"> </w:t>
+      </w:r>
+      <w:r>
+        <w:t xml:space="preserve">“+ Liquidación”</w:t>
+      </w:r>
+      <w:r>
+        <w:t xml:space="preserve">.</w:t>
+      </w:r>
+    </w:p>
+    <w:bookmarkEnd w:id="62"/>
+    <w:bookmarkStart w:id="63" w:name="recibos"/>
+    <w:p>
+      <w:pPr>
+        <w:pStyle w:val="Heading4"/>
+      </w:pPr>
+      <w:r>
+        <w:t xml:space="preserve">Recibos</w:t>
+      </w:r>
+    </w:p>
+    <w:p>
+      <w:pPr>
+        <w:pStyle w:val="FirstParagraph"/>
+      </w:pPr>
+      <w:r>
+        <w:t xml:space="preserve">Cada liquidación</w:t>
+      </w:r>
+      <w:r>
+        <w:t xml:space="preserve"> </w:t>
+      </w:r>
+      <w:r>
+        <w:rPr>
+          <w:b/>
+          <w:bCs/>
+        </w:rPr>
+        <w:t xml:space="preserve">confirmada</w:t>
+      </w:r>
+      <w:r>
+        <w:t xml:space="preserve"> </w:t>
+      </w:r>
+      <w:r>
+        <w:t xml:space="preserve">muestra el botón</w:t>
+      </w:r>
+      <w:r>
+        <w:t xml:space="preserve"> </w:t>
+      </w:r>
+      <w:r>
+        <w:rPr>
+          <w:b/>
+          <w:bCs/>
+        </w:rPr>
+        <w:t xml:space="preserve">🖨 Recibos</w:t>
+      </w:r>
+      <w:r>
+        <w:t xml:space="preserve">: imprime en un solo documento el recibo de haberes de todos los empleados de esa liquidación, dos páginas por empleado (idéntico al formato que emitía antes la contadora) y dos copias —</w:t>
+      </w:r>
+      <w:r>
+        <w:t xml:space="preserve"> </w:t>
+      </w:r>
+      <w:r>
+        <w:rPr>
+          <w:b/>
+          <w:bCs/>
+        </w:rPr>
+        <w:t xml:space="preserve">ORIGINAL</w:t>
+      </w:r>
+      <w:r>
+        <w:t xml:space="preserve"> </w:t>
+      </w:r>
+      <w:r>
+        <w:t xml:space="preserve">y</w:t>
+      </w:r>
+      <w:r>
+        <w:t xml:space="preserve"> </w:t>
+      </w:r>
+      <w:r>
+        <w:rPr>
+          <w:b/>
+          <w:bCs/>
+        </w:rPr>
+        <w:t xml:space="preserve">DUPLICADO</w:t>
+      </w:r>
+      <w:r>
+        <w:t xml:space="preserve"> </w:t>
+      </w:r>
+      <w:r>
+        <w:t xml:space="preserve">— marcadas en el ángulo superior izquierdo. La página 1 trae los datos del empleado, el período, el bloque de sueldo bruto (conceptos con signo), la composición laboral y el neto en letras; la página 2 abre el costo total del empleador (seguridad social, obra social, INSSJP, ART, SCVO, sindical) con una torta de porcentajes.</w:t>
+      </w:r>
+    </w:p>
+    <w:p>
+      <w:pPr>
+        <w:pStyle w:val="BodyText"/>
+      </w:pPr>
+      <w:r>
+        <w:t xml:space="preserve">Antes de imprimir el primer recibo, completá en</w:t>
+      </w:r>
+      <w:r>
+        <w:t xml:space="preserve"> </w:t>
+      </w:r>
+      <w:r>
+        <w:rPr>
+          <w:b/>
+          <w:bCs/>
+        </w:rPr>
+        <w:t xml:space="preserve">Configuración → Imputación → Recibo de haberes</w:t>
+      </w:r>
+      <w:r>
+        <w:t xml:space="preserve">: razón social, domicilio y actividad (encabezado del recibo), y el último depósito previsional — período, fecha y banco — que se muestra en todos los recibos hasta que lo actualices con el próximo F.931 pagado. Ahí mismo está el</w:t>
+      </w:r>
+      <w:r>
+        <w:t xml:space="preserve"> </w:t>
+      </w:r>
+      <w:r>
+        <w:rPr>
+          <w:b/>
+          <w:bCs/>
+        </w:rPr>
+        <w:t xml:space="preserve">tope indemnizatorio</w:t>
+      </w:r>
+      <w:r>
+        <w:t xml:space="preserve"> </w:t>
+      </w:r>
+      <w:r>
+        <w:t xml:space="preserve">que se precarga en la baja de empleado.</w:t>
+      </w:r>
+    </w:p>
+    <w:p>
+      <w:pPr>
+        <w:pStyle w:val="BodyText"/>
+      </w:pPr>
+      <w:r>
+        <w:t xml:space="preserve">Para liquidaciones cargadas</w:t>
+      </w:r>
+      <w:r>
+        <w:t xml:space="preserve"> </w:t>
+      </w:r>
+      <w:r>
+        <w:rPr>
+          <w:b/>
+          <w:bCs/>
+        </w:rPr>
+        <w:t xml:space="preserve">antes</w:t>
+      </w:r>
+      <w:r>
+        <w:t xml:space="preserve"> </w:t>
+      </w:r>
+      <w:r>
+        <w:t xml:space="preserve">de este motor (sin el detalle de contribuciones nuevo), el recibo igual se imprime: usa el total de contribuciones y ART ya guardado como si fuera todo</w:t>
+      </w:r>
+      <w:r>
+        <w:t xml:space="preserve"> </w:t>
+      </w:r>
+      <w:r>
+        <w:t xml:space="preserve">“Seguridad Social”</w:t>
+      </w:r>
+      <w:r>
+        <w:t xml:space="preserve"> </w:t>
+      </w:r>
+      <w:r>
+        <w:t xml:space="preserve">— la página 2 sale menos desglosada, pero cierra al 100 %.</w:t>
+      </w:r>
+    </w:p>
+    <w:bookmarkEnd w:id="63"/>
+    <w:bookmarkStart w:id="64" w:name="conceptos-arca-padrón-marcas-y-txt"/>
+    <w:p>
+      <w:pPr>
+        <w:pStyle w:val="Heading4"/>
+      </w:pPr>
+      <w:r>
+        <w:t xml:space="preserve">Conceptos ARCA (padrón, marcas y TXT)</w:t>
+      </w:r>
+    </w:p>
+    <w:p>
+      <w:pPr>
+        <w:pStyle w:val="FirstParagraph"/>
+      </w:pPr>
+      <w:r>
+        <w:t xml:space="preserve">El botón</w:t>
+      </w:r>
+      <w:r>
+        <w:t xml:space="preserve"> </w:t>
+      </w:r>
+      <w:r>
+        <w:rPr>
+          <w:b/>
+          <w:bCs/>
+        </w:rPr>
+        <w:t xml:space="preserve">Conceptos</w:t>
+      </w:r>
+      <w:r>
+        <w:t xml:space="preserve"> </w:t>
+      </w:r>
+      <w:r>
+        <w:t xml:space="preserve">ahora trae, para cada código propio, el</w:t>
+      </w:r>
+      <w:r>
+        <w:t xml:space="preserve"> </w:t>
+      </w:r>
+      <w:r>
+        <w:rPr>
+          <w:b/>
+          <w:bCs/>
+        </w:rPr>
+        <w:t xml:space="preserve">código ARCA</w:t>
+      </w:r>
+      <w:r>
+        <w:t xml:space="preserve"> </w:t>
+      </w:r>
+      <w:r>
+        <w:t xml:space="preserve">(de un catálogo de 142 posibles, importado del padrón real del CUIT de Vitalmet) y sus</w:t>
+      </w:r>
+      <w:r>
+        <w:t xml:space="preserve"> </w:t>
+      </w:r>
+      <w:r>
+        <w:rPr>
+          <w:b/>
+          <w:bCs/>
+        </w:rPr>
+        <w:t xml:space="preserve">15 marcas</w:t>
+      </w:r>
+      <w:r>
+        <w:t xml:space="preserve"> </w:t>
+      </w:r>
+      <w:r>
+        <w:t xml:space="preserve">(qué subsistema del F.931 suma cada concepto: SIPA, INSSJP, obra social, FSR, RENATEA, AAFF, FNE, LRT, diferencial, especial). La</w:t>
+      </w:r>
+      <w:r>
+        <w:t xml:space="preserve"> </w:t>
+      </w:r>
+      <w:r>
+        <w:rPr>
+          <w:b/>
+          <w:bCs/>
+        </w:rPr>
+        <w:t xml:space="preserve">regla</w:t>
+      </w:r>
+      <w:r>
+        <w:t xml:space="preserve"> </w:t>
+      </w:r>
+      <w:r>
+        <w:t xml:space="preserve">es la fórmula que usa el motor para calcularlo solo (dejarla vacía = concepto que siempre se carga a mano). Un concepto usado en liquidaciones no se borra, se desactiva.</w:t>
       </w:r>
     </w:p>
     <w:p>
@@ -17815,7 +17760,7 @@
         <w:pStyle w:val="Compact"/>
         <w:numPr>
           <w:ilvl w:val="0"/>
-          <w:numId w:val="1025"/>
+          <w:numId w:val="1026"/>
         </w:numPr>
       </w:pPr>
       <w:r>
@@ -17823,34 +17768,165 @@
           <w:b/>
           <w:bCs/>
         </w:rPr>
-        <w:t xml:space="preserve">Cierre RT 54:</w:t>
-      </w:r>
-      <w:r>
-        <w:t xml:space="preserve"> </w:t>
-      </w:r>
-      <w:r>
-        <w:t xml:space="preserve">costo de los bienes vendidos (511000), diferencias de cambio (424006), previsión para incobrables (112090) y su gasto (423007), impuesto a las ganancias (425001) y a pagar (213005), provisión vacaciones (214009) y anticipos de clientes (215001). Preconfiguradas por la migración 072; son las que usan los ajustes de cierre.</w:t>
-      </w:r>
-    </w:p>
-    <w:p>
-      <w:pPr>
-        <w:pStyle w:val="FirstParagraph"/>
-      </w:pPr>
-      <w:r>
-        <w:t xml:space="preserve">Completá y tocá</w:t>
-      </w:r>
-      <w:r>
-        <w:t xml:space="preserve"> </w:t>
-      </w:r>
-      <w:r>
-        <w:rPr>
-          <w:b/>
-          <w:bCs/>
-        </w:rPr>
-        <w:t xml:space="preserve">Guardar configuración</w:t>
-      </w:r>
-      <w:r>
-        <w:t xml:space="preserve">. Si dejás un campo en blanco, ese tipo de asiento automático queda desactivado.</w:t>
+        <w:t xml:space="preserve">Importar padrón…</w:t>
+      </w:r>
+      <w:r>
+        <w:t xml:space="preserve"> </w:t>
+      </w:r>
+      <w:r>
+        <w:t xml:space="preserve">lee el CSV que bajás de ARCA (Libro de Sueldos Digital → Conceptos, separado por</w:t>
+      </w:r>
+      <w:r>
+        <w:t xml:space="preserve"> </w:t>
+      </w:r>
+      <w:r>
+        <w:rPr>
+          <w:rStyle w:val="VerbatimChar"/>
+        </w:rPr>
+        <w:t xml:space="preserve">;</w:t>
+      </w:r>
+      <w:r>
+        <w:t xml:space="preserve">) y compara contra tu catálogo: da de alta como histórico inactivo lo que está en ARCA y no en el ERP, lista lo que está en el ERP y todavía no diste de alta en ARCA, y avisa si las marcas no coinciden.</w:t>
+      </w:r>
+    </w:p>
+    <w:p>
+      <w:pPr>
+        <w:pStyle w:val="Compact"/>
+        <w:numPr>
+          <w:ilvl w:val="0"/>
+          <w:numId w:val="1026"/>
+        </w:numPr>
+      </w:pPr>
+      <w:r>
+        <w:rPr>
+          <w:b/>
+          <w:bCs/>
+        </w:rPr>
+        <w:t xml:space="preserve">Exportar TXT (todos)</w:t>
+      </w:r>
+      <w:r>
+        <w:t xml:space="preserve"> </w:t>
+      </w:r>
+      <w:r>
+        <w:t xml:space="preserve">/</w:t>
+      </w:r>
+      <w:r>
+        <w:t xml:space="preserve"> </w:t>
+      </w:r>
+      <w:r>
+        <w:rPr>
+          <w:b/>
+          <w:bCs/>
+        </w:rPr>
+        <w:t xml:space="preserve">Exportar TXT (faltan en ARCA)</w:t>
+      </w:r>
+      <w:r>
+        <w:t xml:space="preserve"> </w:t>
+      </w:r>
+      <w:r>
+        <w:t xml:space="preserve">generan el archivo de carga masiva de conceptos (195 posiciones) para subir en ARCA → Libro de Sueldos Digital → Conceptos;</w:t>
+      </w:r>
+      <w:r>
+        <w:t xml:space="preserve"> </w:t>
+      </w:r>
+      <w:r>
+        <w:rPr>
+          <w:b/>
+          <w:bCs/>
+        </w:rPr>
+        <w:t xml:space="preserve">Excel ARCA</w:t>
+      </w:r>
+      <w:r>
+        <w:t xml:space="preserve"> </w:t>
+      </w:r>
+      <w:r>
+        <w:t xml:space="preserve">arma la misma información en planilla.</w:t>
+      </w:r>
+    </w:p>
+    <w:p>
+      <w:pPr>
+        <w:pStyle w:val="Compact"/>
+        <w:numPr>
+          <w:ilvl w:val="0"/>
+          <w:numId w:val="1026"/>
+        </w:numPr>
+      </w:pPr>
+      <w:r>
+        <w:rPr>
+          <w:b/>
+          <w:bCs/>
+        </w:rPr>
+        <w:t xml:space="preserve">Bloqueo del LSD:</w:t>
+      </w:r>
+      <w:r>
+        <w:t xml:space="preserve"> </w:t>
+      </w:r>
+      <w:r>
+        <w:t xml:space="preserve">antes de exportar el Libro de Sueldos Digital de una liquidación, el sistema verifica que todos los conceptos usados tengan código ARCA y no sean históricos (</w:t>
+      </w:r>
+      <w:r>
+        <w:t xml:space="preserve">“legacy”</w:t>
+      </w:r>
+      <w:r>
+        <w:t xml:space="preserve">). Si falta alguno, el preview del LSD lo lista y no deja descargar hasta que lo completes en Conceptos.</w:t>
+      </w:r>
+    </w:p>
+    <w:bookmarkEnd w:id="64"/>
+    <w:bookmarkStart w:id="65" w:name="Xb416bb6d091eb5d6a9265a5eb56ebe2b0cc72c7"/>
+    <w:p>
+      <w:pPr>
+        <w:pStyle w:val="Heading4"/>
+      </w:pPr>
+      <w:r>
+        <w:t xml:space="preserve">Preguntas para la contadora (no bloquean el uso del sistema)</w:t>
+      </w:r>
+    </w:p>
+    <w:p>
+      <w:pPr>
+        <w:pStyle w:val="Compact"/>
+        <w:numPr>
+          <w:ilvl w:val="0"/>
+          <w:numId w:val="1027"/>
+        </w:numPr>
+      </w:pPr>
+      <w:r>
+        <w:t xml:space="preserve">Cómo mapea en el LSD los códigos 224, 225 y 516 del recibo de septiembre de 2026, que no están en el padrón de ARCA.</w:t>
+      </w:r>
+    </w:p>
+    <w:p>
+      <w:pPr>
+        <w:pStyle w:val="Compact"/>
+        <w:numPr>
+          <w:ilvl w:val="0"/>
+          <w:numId w:val="1027"/>
+        </w:numPr>
+      </w:pPr>
+      <w:r>
+        <w:t xml:space="preserve">Porcentaje del aporte solidario UOM para no afiliados y valor vigente del seguro de sepelio.</w:t>
+      </w:r>
+    </w:p>
+    <w:p>
+      <w:pPr>
+        <w:pStyle w:val="Compact"/>
+        <w:numPr>
+          <w:ilvl w:val="0"/>
+          <w:numId w:val="1027"/>
+        </w:numPr>
+      </w:pPr>
+      <w:r>
+        <w:t xml:space="preserve">Si el tope de aportes se controla por quincena o por mes.</w:t>
+      </w:r>
+    </w:p>
+    <w:p>
+      <w:pPr>
+        <w:pStyle w:val="Compact"/>
+        <w:numPr>
+          <w:ilvl w:val="0"/>
+          <w:numId w:val="1027"/>
+        </w:numPr>
+      </w:pPr>
+      <w:r>
+        <w:t xml:space="preserve">Tope indemnizatorio vigente del CCT 260/75 (3 × promedio).</w:t>
       </w:r>
     </w:p>
     <w:p>
@@ -17860,15 +17936,16 @@
         </w:pict>
       </w:r>
     </w:p>
-    <w:bookmarkEnd w:id="63"/>
-    <w:bookmarkEnd w:id="64"/>
-    <w:bookmarkStart w:id="69" w:name="X9473a15fdcd54171d921b584f88070d9a9c6e2d"/>
+    <w:bookmarkEnd w:id="65"/>
+    <w:bookmarkEnd w:id="66"/>
+    <w:bookmarkEnd w:id="67"/>
+    <w:bookmarkStart w:id="71" w:name="configuración"/>
     <w:p>
       <w:pPr>
         <w:pStyle w:val="Heading2"/>
       </w:pPr>
       <w:r>
-        <w:t xml:space="preserve">13. Los 4 circuitos completos (lo más importante)</w:t>
+        <w:t xml:space="preserve">12. Configuración</w:t>
       </w:r>
     </w:p>
     <w:p>
@@ -17876,81 +17953,29 @@
         <w:pStyle w:val="FirstParagraph"/>
       </w:pPr>
       <w:r>
-        <w:t xml:space="preserve">Si entendés estos cuatro circuitos, sabés usar el ERP. Seguilos en orden.</w:t>
-      </w:r>
-    </w:p>
-    <w:bookmarkStart w:id="65" w:name="Xfc6a747a46029e6b14e9ea4e3a507ed2abe5c07"/>
+        <w:t xml:space="preserve">Tres pestañas. Las dos últimas son</w:t>
+      </w:r>
+      <w:r>
+        <w:t xml:space="preserve"> </w:t>
+      </w:r>
+      <w:r>
+        <w:rPr>
+          <w:b/>
+          <w:bCs/>
+        </w:rPr>
+        <w:t xml:space="preserve">solo para el administrador</w:t>
+      </w:r>
+      <w:r>
+        <w:t xml:space="preserve">.</w:t>
+      </w:r>
+    </w:p>
+    <w:bookmarkStart w:id="68" w:name="materiales"/>
     <w:p>
       <w:pPr>
         <w:pStyle w:val="Heading3"/>
       </w:pPr>
       <w:r>
-        <w:t xml:space="preserve">Circuito A — Vender (de la cotización al cobro)</w:t>
-      </w:r>
-    </w:p>
-    <w:p>
-      <w:pPr>
-        <w:pStyle w:val="SourceCode"/>
-      </w:pPr>
-      <w:r>
-        <w:rPr>
-          <w:rStyle w:val="VerbatimChar"/>
-        </w:rPr>
-        <w:t xml:space="preserve">1. Clientes          → cargá el cliente (si no existe)</w:t>
-      </w:r>
-      <w:r>
-        <w:br/>
-      </w:r>
-      <w:r>
-        <w:rPr>
-          <w:rStyle w:val="VerbatimChar"/>
-        </w:rPr>
-        <w:t xml:space="preserve">2. Presupuestos      → + Nuevo presupuesto → cargá ítems → mirá el margen → PDF al cliente</w:t>
-      </w:r>
-      <w:r>
-        <w:br/>
-      </w:r>
-      <w:r>
-        <w:rPr>
-          <w:rStyle w:val="VerbatimChar"/>
-        </w:rPr>
-        <w:t xml:space="preserve">3. Presupuestos      → cuando el cliente acepta: estado = aprobado → botón "Venta"</w:t>
-      </w:r>
-      <w:r>
-        <w:br/>
-      </w:r>
-      <w:r>
-        <w:rPr>
-          <w:rStyle w:val="VerbatimChar"/>
-        </w:rPr>
-        <w:t xml:space="preserve">4. Ventas            → revisá el pedido → estado = entregado → genera Remito (PDF) y Certificado</w:t>
-      </w:r>
-      <w:r>
-        <w:br/>
-      </w:r>
-      <w:r>
-        <w:rPr>
-          <w:rStyle w:val="VerbatimChar"/>
-        </w:rPr>
-        <w:t xml:space="preserve">5. Ventas            → botón "Facturar" ⚡ → AFIP devuelve el CAE → factura en PDF</w:t>
-      </w:r>
-      <w:r>
-        <w:br/>
-      </w:r>
-      <w:r>
-        <w:rPr>
-          <w:rStyle w:val="VerbatimChar"/>
-        </w:rPr>
-        <w:t xml:space="preserve">6. Cobros y Pagos    → "Cobro de cliente" → registrá la plata cuando entra</w:t>
-      </w:r>
-      <w:r>
-        <w:br/>
-      </w:r>
-      <w:r>
-        <w:rPr>
-          <w:rStyle w:val="VerbatimChar"/>
-        </w:rPr>
-        <w:t xml:space="preserve">7. Cuenta corriente  → controlá el saldo y la antigüedad de la deuda</w:t>
+        <w:t xml:space="preserve">12.1 Materiales</w:t>
       </w:r>
     </w:p>
     <w:p>
@@ -17958,110 +17983,207 @@
         <w:pStyle w:val="FirstParagraph"/>
       </w:pPr>
       <w:r>
-        <w:rPr>
-          <w:i/>
-          <w:iCs/>
-        </w:rPr>
-        <w:t xml:space="preserve">Asientos generados solos:</w:t>
-      </w:r>
-      <w:r>
-        <w:t xml:space="preserve"> </w:t>
-      </w:r>
-      <w:r>
-        <w:t xml:space="preserve">al facturar (venta) y al cobrar.</w:t>
-      </w:r>
-    </w:p>
-    <w:bookmarkEnd w:id="65"/>
-    <w:bookmarkStart w:id="66" w:name="Xb3ee42997e9ab092cf999dfe51d386c7317685c"/>
+        <w:t xml:space="preserve">El catálogo de tipos de acero / normas que después elegís en barras y certificados.</w:t>
+      </w:r>
+      <w:r>
+        <w:t xml:space="preserve"> </w:t>
+      </w:r>
+      <w:r>
+        <w:rPr>
+          <w:b/>
+          <w:bCs/>
+        </w:rPr>
+        <w:t xml:space="preserve">+ Nuevo material</w:t>
+      </w:r>
+      <w:r>
+        <w:t xml:space="preserve"> </w:t>
+      </w:r>
+      <w:r>
+        <w:t xml:space="preserve">→</w:t>
+      </w:r>
+      <w:r>
+        <w:t xml:space="preserve"> </w:t>
+      </w:r>
+      <w:r>
+        <w:rPr>
+          <w:b/>
+          <w:bCs/>
+        </w:rPr>
+        <w:t xml:space="preserve">Material / Norma</w:t>
+      </w:r>
+      <w:r>
+        <w:t xml:space="preserve"> </w:t>
+      </w:r>
+      <w:r>
+        <w:t xml:space="preserve">*,</w:t>
+      </w:r>
+      <w:r>
+        <w:t xml:space="preserve"> </w:t>
+      </w:r>
+      <w:r>
+        <w:rPr>
+          <w:b/>
+          <w:bCs/>
+        </w:rPr>
+        <w:t xml:space="preserve">Descripción</w:t>
+      </w:r>
+      <w:r>
+        <w:t xml:space="preserve">,</w:t>
+      </w:r>
+      <w:r>
+        <w:t xml:space="preserve"> </w:t>
+      </w:r>
+      <w:r>
+        <w:rPr>
+          <w:b/>
+          <w:bCs/>
+        </w:rPr>
+        <w:t xml:space="preserve">Orden</w:t>
+      </w:r>
+      <w:r>
+        <w:t xml:space="preserve">,</w:t>
+      </w:r>
+      <w:r>
+        <w:t xml:space="preserve"> </w:t>
+      </w:r>
+      <w:r>
+        <w:rPr>
+          <w:b/>
+          <w:bCs/>
+        </w:rPr>
+        <w:t xml:space="preserve">Estado</w:t>
+      </w:r>
+      <w:r>
+        <w:t xml:space="preserve"> </w:t>
+      </w:r>
+      <w:r>
+        <w:t xml:space="preserve">(activo / inactivo).</w:t>
+      </w:r>
+    </w:p>
+    <w:bookmarkEnd w:id="68"/>
+    <w:bookmarkStart w:id="69" w:name="usuarios-y-permisos-admin"/>
     <w:p>
       <w:pPr>
         <w:pStyle w:val="Heading3"/>
       </w:pPr>
       <w:r>
-        <w:t xml:space="preserve">Circuito B — Comprar (de la OC al material liberado)</w:t>
-      </w:r>
-    </w:p>
-    <w:p>
-      <w:pPr>
-        <w:pStyle w:val="SourceCode"/>
-      </w:pPr>
-      <w:r>
-        <w:rPr>
-          <w:rStyle w:val="VerbatimChar"/>
-        </w:rPr>
-        <w:t xml:space="preserve">1. Proveedores        → cargá el proveedor; si es material crítico: evaluálo y aprobalo en el AVL</w:t>
-      </w:r>
-      <w:r>
-        <w:br/>
-      </w:r>
-      <w:r>
-        <w:rPr>
-          <w:rStyle w:val="VerbatimChar"/>
-        </w:rPr>
-        <w:t xml:space="preserve">2. Compras → OC       → + Nueva OC → ítems → moneda y TC → estado = enviada/confirmada</w:t>
-      </w:r>
-      <w:r>
-        <w:br/>
-      </w:r>
-      <w:r>
-        <w:rPr>
-          <w:rStyle w:val="VerbatimChar"/>
-        </w:rPr>
-        <w:t xml:space="preserve">                        (el sistema rechaza la OC si el proveedor crítico no está aprobado)</w:t>
-      </w:r>
-      <w:r>
-        <w:br/>
-      </w:r>
-      <w:r>
-        <w:rPr>
-          <w:rStyle w:val="VerbatimChar"/>
-        </w:rPr>
-        <w:t xml:space="preserve">3. Compras → OC       → botón "Recibir" cuando llega la mercadería  (asiento GR/IR)</w:t>
-      </w:r>
-      <w:r>
-        <w:br/>
-      </w:r>
-      <w:r>
-        <w:rPr>
-          <w:rStyle w:val="VerbatimChar"/>
-        </w:rPr>
-        <w:t xml:space="preserve">                        → la materia prima entra EN CUARENTENA</w:t>
-      </w:r>
-      <w:r>
-        <w:br/>
-      </w:r>
-      <w:r>
-        <w:rPr>
-          <w:rStyle w:val="VerbatimChar"/>
-        </w:rPr>
-        <w:t xml:space="preserve">4. Inventario → Cert. MTC      → cargá el MTR con su colada y vinculalo</w:t>
-      </w:r>
-      <w:r>
-        <w:br/>
-      </w:r>
-      <w:r>
-        <w:rPr>
-          <w:rStyle w:val="VerbatimChar"/>
-        </w:rPr>
-        <w:t xml:space="preserve">5. Compras → Inspección        → verificá material + MTR → ✓ Aceptar (o ✕ Rechazar + NC)</w:t>
-      </w:r>
-      <w:r>
-        <w:br/>
-      </w:r>
-      <w:r>
-        <w:rPr>
-          <w:rStyle w:val="VerbatimChar"/>
-        </w:rPr>
-        <w:t xml:space="preserve">6. Compras → OC       → botón "Factura" cuando llega la factura     (3-way match, cancela GR/IR)</w:t>
-      </w:r>
-      <w:r>
-        <w:br/>
-      </w:r>
-      <w:r>
-        <w:rPr>
-          <w:rStyle w:val="VerbatimChar"/>
-        </w:rPr>
-        <w:t xml:space="preserve">7. Cobros y Pagos     → "Pago a proveedor" cuando pagás</w:t>
+        <w:t xml:space="preserve">12.2 Usuarios y permisos (admin)</w:t>
+      </w:r>
+    </w:p>
+    <w:p>
+      <w:pPr>
+        <w:pStyle w:val="Compact"/>
+        <w:numPr>
+          <w:ilvl w:val="0"/>
+          <w:numId w:val="1028"/>
+        </w:numPr>
+      </w:pPr>
+      <w:r>
+        <w:t xml:space="preserve">Ves y podés</w:t>
+      </w:r>
+      <w:r>
+        <w:t xml:space="preserve"> </w:t>
+      </w:r>
+      <w:r>
+        <w:rPr>
+          <w:b/>
+          <w:bCs/>
+        </w:rPr>
+        <w:t xml:space="preserve">cambiar el código de empresa</w:t>
+      </w:r>
+      <w:r>
+        <w:t xml:space="preserve"> </w:t>
+      </w:r>
+      <w:r>
+        <w:t xml:space="preserve">(el que usan los nuevos para unirse).</w:t>
+      </w:r>
+    </w:p>
+    <w:p>
+      <w:pPr>
+        <w:pStyle w:val="Compact"/>
+        <w:numPr>
+          <w:ilvl w:val="0"/>
+          <w:numId w:val="1028"/>
+        </w:numPr>
+      </w:pPr>
+      <w:r>
+        <w:t xml:space="preserve">Listás usuarios, editás su</w:t>
+      </w:r>
+      <w:r>
+        <w:t xml:space="preserve"> </w:t>
+      </w:r>
+      <w:r>
+        <w:rPr>
+          <w:b/>
+          <w:bCs/>
+        </w:rPr>
+        <w:t xml:space="preserve">rol</w:t>
+      </w:r>
+      <w:r>
+        <w:t xml:space="preserve"> </w:t>
+      </w:r>
+      <w:r>
+        <w:t xml:space="preserve">y</w:t>
+      </w:r>
+      <w:r>
+        <w:t xml:space="preserve"> </w:t>
+      </w:r>
+      <w:r>
+        <w:rPr>
+          <w:b/>
+          <w:bCs/>
+        </w:rPr>
+        <w:t xml:space="preserve">habilitás/deshabilitás módulos</w:t>
+      </w:r>
+      <w:r>
+        <w:t xml:space="preserve"> </w:t>
+      </w:r>
+      <w:r>
+        <w:t xml:space="preserve">por usuario. La lista cubre todos los módulos del sistema (inventario, producción, compras, ventas, calidad, análisis y contabilidad).</w:t>
+      </w:r>
+    </w:p>
+    <w:p>
+      <w:pPr>
+        <w:pStyle w:val="BlockText"/>
+      </w:pPr>
+      <w:r>
+        <w:rPr>
+          <w:b/>
+          <w:bCs/>
+        </w:rPr>
+        <w:t xml:space="preserve">Nota técnica:</w:t>
+      </w:r>
+      <w:r>
+        <w:t xml:space="preserve"> </w:t>
+      </w:r>
+      <w:r>
+        <w:t xml:space="preserve">los permisos por módulo hoy son</w:t>
+      </w:r>
+      <w:r>
+        <w:t xml:space="preserve"> </w:t>
+      </w:r>
+      <w:r>
+        <w:rPr>
+          <w:b/>
+          <w:bCs/>
+        </w:rPr>
+        <w:t xml:space="preserve">visuales</w:t>
+      </w:r>
+      <w:r>
+        <w:t xml:space="preserve"> </w:t>
+      </w:r>
+      <w:r>
+        <w:t xml:space="preserve">(esconden secciones del menú). No los uses como barrera de seguridad fuerte.</w:t>
+      </w:r>
+    </w:p>
+    <w:bookmarkEnd w:id="69"/>
+    <w:bookmarkStart w:id="70" w:name="imputación-contable"/>
+    <w:p>
+      <w:pPr>
+        <w:pStyle w:val="Heading3"/>
+      </w:pPr>
+      <w:r>
+        <w:t xml:space="preserve">12.3 Imputación contable</w:t>
       </w:r>
     </w:p>
     <w:p>
@@ -18070,175 +18192,257 @@
       </w:pPr>
       <w:r>
         <w:rPr>
-          <w:i/>
-          <w:iCs/>
-        </w:rPr>
-        <w:t xml:space="preserve">Asientos generados solos:</w:t>
-      </w:r>
-      <w:r>
-        <w:t xml:space="preserve"> </w:t>
-      </w:r>
-      <w:r>
-        <w:t xml:space="preserve">en la recepción (GR/IR), en la factura y en el pago.</w:t>
-      </w:r>
-    </w:p>
-    <w:bookmarkEnd w:id="66"/>
-    <w:bookmarkStart w:id="67" w:name="Xd1d7949bac4e6a12c5bcb040f4ddda9ac7470f4"/>
-    <w:p>
-      <w:pPr>
-        <w:pStyle w:val="Heading3"/>
-      </w:pPr>
-      <w:r>
-        <w:t xml:space="preserve">Circuito C — Producir (de la barra al producto)</w:t>
-      </w:r>
-    </w:p>
-    <w:p>
-      <w:pPr>
-        <w:pStyle w:val="SourceCode"/>
-      </w:pPr>
-      <w:r>
-        <w:rPr>
-          <w:rStyle w:val="VerbatimChar"/>
-        </w:rPr>
-        <w:t xml:space="preserve">1. Compras            → comprás la barra de acero (Circuito B, con inspección aceptada)</w:t>
-      </w:r>
-      <w:r>
-        <w:br/>
-      </w:r>
-      <w:r>
-        <w:rPr>
-          <w:rStyle w:val="VerbatimChar"/>
-        </w:rPr>
-        <w:t xml:space="preserve">2. Producción → OP    → + Nueva orden → elegí la barra ACEPTADA → metros consumidos → piezas</w:t>
-      </w:r>
-      <w:r>
-        <w:br/>
-      </w:r>
-      <w:r>
-        <w:rPr>
-          <w:rStyle w:val="VerbatimChar"/>
-        </w:rPr>
-        <w:t xml:space="preserve">3. Producción → OP    → Tiempos → aplicá el PQP del producto (o cargá los pasos a mano)</w:t>
-      </w:r>
-      <w:r>
-        <w:br/>
-      </w:r>
-      <w:r>
-        <w:rPr>
-          <w:rStyle w:val="VerbatimChar"/>
-        </w:rPr>
-        <w:t xml:space="preserve">4. Producción         → cronometrá los pasos; en cada HOLD/WITNESS: Calidad firma QC</w:t>
-      </w:r>
-      <w:r>
-        <w:br/>
-      </w:r>
-      <w:r>
-        <w:rPr>
-          <w:rStyle w:val="VerbatimChar"/>
-        </w:rPr>
-        <w:t xml:space="preserve">5. Producción         → botón Ensayo → registrá hidrostático/dimensional/etc. con instrumento calibrado</w:t>
-      </w:r>
-      <w:r>
-        <w:br/>
-      </w:r>
-      <w:r>
-        <w:rPr>
-          <w:rStyle w:val="VerbatimChar"/>
-        </w:rPr>
-        <w:t xml:space="preserve">6. Producción → OP    → estado = completada (solo si no quedan puntos sin firmar)</w:t>
-      </w:r>
-      <w:r>
-        <w:br/>
-      </w:r>
-      <w:r>
-        <w:rPr>
-          <w:rStyle w:val="VerbatimChar"/>
-        </w:rPr>
-        <w:t xml:space="preserve">                        → se descuenta MP y nace el Producto Terminado</w:t>
-      </w:r>
-      <w:r>
-        <w:br/>
-      </w:r>
-      <w:r>
-        <w:rPr>
-          <w:rStyle w:val="VerbatimChar"/>
-        </w:rPr>
-        <w:t xml:space="preserve">7. Análisis → Trazabilidad     → verificá la cadena certificado → colada → barra → OP → PT</w:t>
-      </w:r>
-    </w:p>
-    <w:bookmarkEnd w:id="67"/>
-    <w:bookmarkStart w:id="68" w:name="Xf9a70cdce17ec8d32f80fb3b897c3b5e5c61186"/>
-    <w:p>
-      <w:pPr>
-        <w:pStyle w:val="Heading3"/>
-      </w:pPr>
-      <w:r>
-        <w:t xml:space="preserve">Circuito D — Tratar un problema de calidad (NC → CAPA)</w:t>
-      </w:r>
-    </w:p>
-    <w:p>
-      <w:pPr>
-        <w:pStyle w:val="SourceCode"/>
-      </w:pPr>
-      <w:r>
-        <w:rPr>
-          <w:rStyle w:val="VerbatimChar"/>
-        </w:rPr>
-        <w:t xml:space="preserve">1. Se detecta el problema   → recepción rechazada, ensayo no conforme o reclamo de cliente</w:t>
-      </w:r>
-      <w:r>
-        <w:br/>
-      </w:r>
-      <w:r>
-        <w:rPr>
-          <w:rStyle w:val="VerbatimChar"/>
-        </w:rPr>
-        <w:t xml:space="preserve">2. Calidad → NCR            → + Nueva NC → origen + vínculos (OP/recepción/venta/ensayo) + descripción</w:t>
-      </w:r>
-      <w:r>
-        <w:br/>
-      </w:r>
-      <w:r>
-        <w:rPr>
-          <w:rStyle w:val="VerbatimChar"/>
-        </w:rPr>
-        <w:t xml:space="preserve">3. Definí la disposición    → retrabajo / reproceso / rechazo / concesión (con justificación) / devolución</w:t>
-      </w:r>
-      <w:r>
-        <w:br/>
-      </w:r>
-      <w:r>
-        <w:rPr>
-          <w:rStyle w:val="VerbatimChar"/>
-        </w:rPr>
-        <w:t xml:space="preserve">4. Si amerita atacar la causa: + Nueva CAPA → causa raíz → acción → responsable → fecha compromiso</w:t>
-      </w:r>
-      <w:r>
-        <w:br/>
-      </w:r>
-      <w:r>
-        <w:rPr>
-          <w:rStyle w:val="VerbatimChar"/>
-        </w:rPr>
-        <w:t xml:space="preserve">5. Implementá la acción     → cargá fecha de implementación</w:t>
-      </w:r>
-      <w:r>
-        <w:br/>
-      </w:r>
-      <w:r>
-        <w:rPr>
-          <w:rStyle w:val="VerbatimChar"/>
-        </w:rPr>
-        <w:t xml:space="preserve">6. Verificá la eficacia     → cargá cómo lo comprobaste + ¿Eficaz? → cerrá la CAPA</w:t>
-      </w:r>
-      <w:r>
-        <w:br/>
-      </w:r>
-      <w:r>
-        <w:rPr>
-          <w:rStyle w:val="VerbatimChar"/>
-        </w:rPr>
-        <w:t xml:space="preserve">7. Cerrá la NC              → (si es de origen cliente, antes marcá "Cliente notificado = Sí")</w:t>
+          <w:b/>
+          <w:bCs/>
+        </w:rPr>
+        <w:t xml:space="preserve">Clave para que los asientos automáticos funcionen.</w:t>
+      </w:r>
+      <w:r>
+        <w:t xml:space="preserve"> </w:t>
+      </w:r>
+      <w:r>
+        <w:t xml:space="preserve">Acá decís qué cuenta contable usar para cada tipo de operación:</w:t>
+      </w:r>
+    </w:p>
+    <w:p>
+      <w:pPr>
+        <w:pStyle w:val="Compact"/>
+        <w:numPr>
+          <w:ilvl w:val="0"/>
+          <w:numId w:val="1029"/>
+        </w:numPr>
+      </w:pPr>
+      <w:r>
+        <w:rPr>
+          <w:b/>
+          <w:bCs/>
+        </w:rPr>
+        <w:t xml:space="preserve">Ventas:</w:t>
+      </w:r>
+      <w:r>
+        <w:t xml:space="preserve"> </w:t>
+      </w:r>
+      <w:r>
+        <w:t xml:space="preserve">cuenta de venta, deudores por ventas, IVA débito fiscal,</w:t>
+      </w:r>
+      <w:r>
+        <w:t xml:space="preserve"> </w:t>
+      </w:r>
+      <w:r>
+        <w:rPr>
+          <w:b/>
+          <w:bCs/>
+        </w:rPr>
+        <w:t xml:space="preserve">alícuota de IVA</w:t>
+      </w:r>
+      <w:r>
+        <w:t xml:space="preserve"> </w:t>
+      </w:r>
+      <w:r>
+        <w:t xml:space="preserve">(21% por defecto), si los precios</w:t>
+      </w:r>
+      <w:r>
+        <w:t xml:space="preserve"> </w:t>
+      </w:r>
+      <w:r>
+        <w:rPr>
+          <w:b/>
+          <w:bCs/>
+        </w:rPr>
+        <w:t xml:space="preserve">incluyen IVA</w:t>
+      </w:r>
+      <w:r>
+        <w:t xml:space="preserve">, y el</w:t>
+      </w:r>
+      <w:r>
+        <w:t xml:space="preserve"> </w:t>
+      </w:r>
+      <w:r>
+        <w:rPr>
+          <w:b/>
+          <w:bCs/>
+        </w:rPr>
+        <w:t xml:space="preserve">punto de venta AFIP</w:t>
+      </w:r>
+      <w:r>
+        <w:t xml:space="preserve"> </w:t>
+      </w:r>
+      <w:r>
+        <w:t xml:space="preserve">para la facturación electrónica.</w:t>
+      </w:r>
+    </w:p>
+    <w:p>
+      <w:pPr>
+        <w:pStyle w:val="Compact"/>
+        <w:numPr>
+          <w:ilvl w:val="0"/>
+          <w:numId w:val="1029"/>
+        </w:numPr>
+      </w:pPr>
+      <w:r>
+        <w:rPr>
+          <w:b/>
+          <w:bCs/>
+        </w:rPr>
+        <w:t xml:space="preserve">Compras:</w:t>
+      </w:r>
+      <w:r>
+        <w:t xml:space="preserve"> </w:t>
+      </w:r>
+      <w:r>
+        <w:t xml:space="preserve">IVA crédito fiscal, proveedores, compra de materia prima / insumos / herramientas, servicios de terceros, y la cuenta puente</w:t>
+      </w:r>
+      <w:r>
+        <w:t xml:space="preserve"> </w:t>
+      </w:r>
+      <w:r>
+        <w:rPr>
+          <w:b/>
+          <w:bCs/>
+        </w:rPr>
+        <w:t xml:space="preserve">GR/IR</w:t>
+      </w:r>
+      <w:r>
+        <w:t xml:space="preserve"> </w:t>
+      </w:r>
+      <w:r>
+        <w:t xml:space="preserve">(facturas a recibir).</w:t>
+      </w:r>
+    </w:p>
+    <w:p>
+      <w:pPr>
+        <w:pStyle w:val="Compact"/>
+        <w:numPr>
+          <w:ilvl w:val="0"/>
+          <w:numId w:val="1029"/>
+        </w:numPr>
+      </w:pPr>
+      <w:r>
+        <w:rPr>
+          <w:b/>
+          <w:bCs/>
+        </w:rPr>
+        <w:t xml:space="preserve">Caja y banco:</w:t>
+      </w:r>
+      <w:r>
+        <w:t xml:space="preserve"> </w:t>
+      </w:r>
+      <w:r>
+        <w:t xml:space="preserve">cuenta de caja (efectivo), cuenta de banco (transferencias),</w:t>
+      </w:r>
+      <w:r>
+        <w:t xml:space="preserve"> </w:t>
+      </w:r>
+      <w:r>
+        <w:rPr>
+          <w:b/>
+          <w:bCs/>
+        </w:rPr>
+        <w:t xml:space="preserve">cheques en cartera</w:t>
+      </w:r>
+      <w:r>
+        <w:t xml:space="preserve"> </w:t>
+      </w:r>
+      <w:r>
+        <w:t xml:space="preserve">(recibidos) y</w:t>
+      </w:r>
+      <w:r>
+        <w:t xml:space="preserve"> </w:t>
+      </w:r>
+      <w:r>
+        <w:rPr>
+          <w:b/>
+          <w:bCs/>
+        </w:rPr>
+        <w:t xml:space="preserve">cheques emitidos</w:t>
+      </w:r>
+      <w:r>
+        <w:t xml:space="preserve"> </w:t>
+      </w:r>
+      <w:r>
+        <w:t xml:space="preserve">(a pagar).</w:t>
+      </w:r>
+    </w:p>
+    <w:p>
+      <w:pPr>
+        <w:pStyle w:val="Compact"/>
+        <w:numPr>
+          <w:ilvl w:val="0"/>
+          <w:numId w:val="1029"/>
+        </w:numPr>
+      </w:pPr>
+      <w:r>
+        <w:rPr>
+          <w:b/>
+          <w:bCs/>
+        </w:rPr>
+        <w:t xml:space="preserve">Retenciones sufridas:</w:t>
+      </w:r>
+      <w:r>
+        <w:t xml:space="preserve"> </w:t>
+      </w:r>
+      <w:r>
+        <w:t xml:space="preserve">las cuentas de crédito fiscal donde van las retenciones que te aplican los clientes (Ganancias, IIBB, SUSS, IVA). Vienen preconfiguradas con las cuentas del plan de Vitalmet.</w:t>
+      </w:r>
+    </w:p>
+    <w:p>
+      <w:pPr>
+        <w:pStyle w:val="Compact"/>
+        <w:numPr>
+          <w:ilvl w:val="0"/>
+          <w:numId w:val="1029"/>
+        </w:numPr>
+      </w:pPr>
+      <w:r>
+        <w:rPr>
+          <w:b/>
+          <w:bCs/>
+        </w:rPr>
+        <w:t xml:space="preserve">Stock y ajustes de inventario:</w:t>
+      </w:r>
+      <w:r>
+        <w:t xml:space="preserve"> </w:t>
+      </w:r>
+      <w:r>
+        <w:t xml:space="preserve">las cuentas de stock (materia prima, producto terminado, insumos) y la cuenta de resultado</w:t>
+      </w:r>
+      <w:r>
+        <w:t xml:space="preserve"> </w:t>
+      </w:r>
+      <w:r>
+        <w:rPr>
+          <w:b/>
+          <w:bCs/>
+        </w:rPr>
+        <w:t xml:space="preserve">AJUSTES DE INVENTARIO</w:t>
+      </w:r>
+      <w:r>
+        <w:t xml:space="preserve"> </w:t>
+      </w:r>
+      <w:r>
+        <w:t xml:space="preserve">contra la que se asientan las diferencias de ajustes y conteos físicos. Vienen preconfiguradas (114002 / 114001 / 114003 / 421099).</w:t>
+      </w:r>
+    </w:p>
+    <w:p>
+      <w:pPr>
+        <w:pStyle w:val="Compact"/>
+        <w:numPr>
+          <w:ilvl w:val="0"/>
+          <w:numId w:val="1029"/>
+        </w:numPr>
+      </w:pPr>
+      <w:r>
+        <w:rPr>
+          <w:b/>
+          <w:bCs/>
+        </w:rPr>
+        <w:t xml:space="preserve">Cierre RT 54:</w:t>
+      </w:r>
+      <w:r>
+        <w:t xml:space="preserve"> </w:t>
+      </w:r>
+      <w:r>
+        <w:t xml:space="preserve">costo de los bienes vendidos (511000), diferencias de cambio (424006), previsión para incobrables (112090) y su gasto (423007), impuesto a las ganancias (425001) y a pagar (213005), provisión vacaciones (214009) y anticipos de clientes (215001). Preconfiguradas por la migración 072; son las que usan los ajustes de cierre.</w:t>
       </w:r>
     </w:p>
     <w:p>
@@ -18246,11 +18450,20 @@
         <w:pStyle w:val="FirstParagraph"/>
       </w:pPr>
       <w:r>
-        <w:rPr>
-          <w:i/>
-          <w:iCs/>
-        </w:rPr>
-        <w:t xml:space="preserve">El sistema no te deja saltear los pasos 3, 6 y 7: son los candados del SGC.</w:t>
+        <w:t xml:space="preserve">Completá y tocá</w:t>
+      </w:r>
+      <w:r>
+        <w:t xml:space="preserve"> </w:t>
+      </w:r>
+      <w:r>
+        <w:rPr>
+          <w:b/>
+          <w:bCs/>
+        </w:rPr>
+        <w:t xml:space="preserve">Guardar configuración</w:t>
+      </w:r>
+      <w:r>
+        <w:t xml:space="preserve">. Si dejás un campo en blanco, ese tipo de asiento automático queda desactivado.</w:t>
       </w:r>
     </w:p>
     <w:p>
@@ -18260,9 +18473,409 @@
         </w:pict>
       </w:r>
     </w:p>
-    <w:bookmarkEnd w:id="68"/>
-    <w:bookmarkEnd w:id="69"/>
-    <w:bookmarkStart w:id="70" w:name="reglas-de-oro-y-errores-comunes"/>
+    <w:bookmarkEnd w:id="70"/>
+    <w:bookmarkEnd w:id="71"/>
+    <w:bookmarkStart w:id="76" w:name="X9473a15fdcd54171d921b584f88070d9a9c6e2d"/>
+    <w:p>
+      <w:pPr>
+        <w:pStyle w:val="Heading2"/>
+      </w:pPr>
+      <w:r>
+        <w:t xml:space="preserve">13. Los 4 circuitos completos (lo más importante)</w:t>
+      </w:r>
+    </w:p>
+    <w:p>
+      <w:pPr>
+        <w:pStyle w:val="FirstParagraph"/>
+      </w:pPr>
+      <w:r>
+        <w:t xml:space="preserve">Si entendés estos cuatro circuitos, sabés usar el ERP. Seguilos en orden.</w:t>
+      </w:r>
+    </w:p>
+    <w:bookmarkStart w:id="72" w:name="Xfc6a747a46029e6b14e9ea4e3a507ed2abe5c07"/>
+    <w:p>
+      <w:pPr>
+        <w:pStyle w:val="Heading3"/>
+      </w:pPr>
+      <w:r>
+        <w:t xml:space="preserve">Circuito A — Vender (de la cotización al cobro)</w:t>
+      </w:r>
+    </w:p>
+    <w:p>
+      <w:pPr>
+        <w:pStyle w:val="SourceCode"/>
+      </w:pPr>
+      <w:r>
+        <w:rPr>
+          <w:rStyle w:val="VerbatimChar"/>
+        </w:rPr>
+        <w:t xml:space="preserve">1. Clientes          → cargá el cliente (si no existe)</w:t>
+      </w:r>
+      <w:r>
+        <w:br/>
+      </w:r>
+      <w:r>
+        <w:rPr>
+          <w:rStyle w:val="VerbatimChar"/>
+        </w:rPr>
+        <w:t xml:space="preserve">2. Presupuestos      → + Nuevo presupuesto → cargá ítems → mirá el margen → PDF al cliente</w:t>
+      </w:r>
+      <w:r>
+        <w:br/>
+      </w:r>
+      <w:r>
+        <w:rPr>
+          <w:rStyle w:val="VerbatimChar"/>
+        </w:rPr>
+        <w:t xml:space="preserve">3. Presupuestos      → cuando el cliente acepta: estado = aprobado → botón "Venta"</w:t>
+      </w:r>
+      <w:r>
+        <w:br/>
+      </w:r>
+      <w:r>
+        <w:rPr>
+          <w:rStyle w:val="VerbatimChar"/>
+        </w:rPr>
+        <w:t xml:space="preserve">4. Ventas            → revisá el pedido → estado = entregado → genera Remito (PDF) y Certificado</w:t>
+      </w:r>
+      <w:r>
+        <w:br/>
+      </w:r>
+      <w:r>
+        <w:rPr>
+          <w:rStyle w:val="VerbatimChar"/>
+        </w:rPr>
+        <w:t xml:space="preserve">5. Ventas            → botón "Facturar" ⚡ → AFIP devuelve el CAE → factura en PDF</w:t>
+      </w:r>
+      <w:r>
+        <w:br/>
+      </w:r>
+      <w:r>
+        <w:rPr>
+          <w:rStyle w:val="VerbatimChar"/>
+        </w:rPr>
+        <w:t xml:space="preserve">6. Cobros y Pagos    → "Cobro de cliente" → registrá la plata cuando entra</w:t>
+      </w:r>
+      <w:r>
+        <w:br/>
+      </w:r>
+      <w:r>
+        <w:rPr>
+          <w:rStyle w:val="VerbatimChar"/>
+        </w:rPr>
+        <w:t xml:space="preserve">7. Cuenta corriente  → controlá el saldo y la antigüedad de la deuda</w:t>
+      </w:r>
+    </w:p>
+    <w:p>
+      <w:pPr>
+        <w:pStyle w:val="FirstParagraph"/>
+      </w:pPr>
+      <w:r>
+        <w:rPr>
+          <w:i/>
+          <w:iCs/>
+        </w:rPr>
+        <w:t xml:space="preserve">Asientos generados solos:</w:t>
+      </w:r>
+      <w:r>
+        <w:t xml:space="preserve"> </w:t>
+      </w:r>
+      <w:r>
+        <w:t xml:space="preserve">al facturar (venta) y al cobrar.</w:t>
+      </w:r>
+    </w:p>
+    <w:bookmarkEnd w:id="72"/>
+    <w:bookmarkStart w:id="73" w:name="Xb3ee42997e9ab092cf999dfe51d386c7317685c"/>
+    <w:p>
+      <w:pPr>
+        <w:pStyle w:val="Heading3"/>
+      </w:pPr>
+      <w:r>
+        <w:t xml:space="preserve">Circuito B — Comprar (de la OC al material liberado)</w:t>
+      </w:r>
+    </w:p>
+    <w:p>
+      <w:pPr>
+        <w:pStyle w:val="SourceCode"/>
+      </w:pPr>
+      <w:r>
+        <w:rPr>
+          <w:rStyle w:val="VerbatimChar"/>
+        </w:rPr>
+        <w:t xml:space="preserve">1. Proveedores        → cargá el proveedor; si es material crítico: evaluálo y aprobalo en el AVL</w:t>
+      </w:r>
+      <w:r>
+        <w:br/>
+      </w:r>
+      <w:r>
+        <w:rPr>
+          <w:rStyle w:val="VerbatimChar"/>
+        </w:rPr>
+        <w:t xml:space="preserve">2. Compras → OC       → + Nueva OC → ítems → moneda y TC → estado = enviada/confirmada</w:t>
+      </w:r>
+      <w:r>
+        <w:br/>
+      </w:r>
+      <w:r>
+        <w:rPr>
+          <w:rStyle w:val="VerbatimChar"/>
+        </w:rPr>
+        <w:t xml:space="preserve">                        (el sistema rechaza la OC si el proveedor crítico no está aprobado)</w:t>
+      </w:r>
+      <w:r>
+        <w:br/>
+      </w:r>
+      <w:r>
+        <w:rPr>
+          <w:rStyle w:val="VerbatimChar"/>
+        </w:rPr>
+        <w:t xml:space="preserve">3. Compras → OC       → botón "Recibir" cuando llega la mercadería  (asiento GR/IR)</w:t>
+      </w:r>
+      <w:r>
+        <w:br/>
+      </w:r>
+      <w:r>
+        <w:rPr>
+          <w:rStyle w:val="VerbatimChar"/>
+        </w:rPr>
+        <w:t xml:space="preserve">                        → la materia prima entra EN CUARENTENA</w:t>
+      </w:r>
+      <w:r>
+        <w:br/>
+      </w:r>
+      <w:r>
+        <w:rPr>
+          <w:rStyle w:val="VerbatimChar"/>
+        </w:rPr>
+        <w:t xml:space="preserve">4. Inventario → Cert. MTC      → cargá el MTR con su colada y vinculalo</w:t>
+      </w:r>
+      <w:r>
+        <w:br/>
+      </w:r>
+      <w:r>
+        <w:rPr>
+          <w:rStyle w:val="VerbatimChar"/>
+        </w:rPr>
+        <w:t xml:space="preserve">5. Compras → Inspección        → verificá material + MTR → ✓ Aceptar (o ✕ Rechazar + NC)</w:t>
+      </w:r>
+      <w:r>
+        <w:br/>
+      </w:r>
+      <w:r>
+        <w:rPr>
+          <w:rStyle w:val="VerbatimChar"/>
+        </w:rPr>
+        <w:t xml:space="preserve">6. Compras → OC       → botón "Factura" cuando llega la factura     (3-way match, cancela GR/IR)</w:t>
+      </w:r>
+      <w:r>
+        <w:br/>
+      </w:r>
+      <w:r>
+        <w:rPr>
+          <w:rStyle w:val="VerbatimChar"/>
+        </w:rPr>
+        <w:t xml:space="preserve">7. Cobros y Pagos     → "Pago a proveedor" cuando pagás</w:t>
+      </w:r>
+    </w:p>
+    <w:p>
+      <w:pPr>
+        <w:pStyle w:val="FirstParagraph"/>
+      </w:pPr>
+      <w:r>
+        <w:rPr>
+          <w:i/>
+          <w:iCs/>
+        </w:rPr>
+        <w:t xml:space="preserve">Asientos generados solos:</w:t>
+      </w:r>
+      <w:r>
+        <w:t xml:space="preserve"> </w:t>
+      </w:r>
+      <w:r>
+        <w:t xml:space="preserve">en la recepción (GR/IR), en la factura y en el pago.</w:t>
+      </w:r>
+    </w:p>
+    <w:bookmarkEnd w:id="73"/>
+    <w:bookmarkStart w:id="74" w:name="Xd1d7949bac4e6a12c5bcb040f4ddda9ac7470f4"/>
+    <w:p>
+      <w:pPr>
+        <w:pStyle w:val="Heading3"/>
+      </w:pPr>
+      <w:r>
+        <w:t xml:space="preserve">Circuito C — Producir (de la barra al producto)</w:t>
+      </w:r>
+    </w:p>
+    <w:p>
+      <w:pPr>
+        <w:pStyle w:val="SourceCode"/>
+      </w:pPr>
+      <w:r>
+        <w:rPr>
+          <w:rStyle w:val="VerbatimChar"/>
+        </w:rPr>
+        <w:t xml:space="preserve">1. Compras            → comprás la barra de acero (Circuito B, con inspección aceptada)</w:t>
+      </w:r>
+      <w:r>
+        <w:br/>
+      </w:r>
+      <w:r>
+        <w:rPr>
+          <w:rStyle w:val="VerbatimChar"/>
+        </w:rPr>
+        <w:t xml:space="preserve">2. Producción → OP    → + Nueva orden → elegí la barra ACEPTADA → metros consumidos → piezas</w:t>
+      </w:r>
+      <w:r>
+        <w:br/>
+      </w:r>
+      <w:r>
+        <w:rPr>
+          <w:rStyle w:val="VerbatimChar"/>
+        </w:rPr>
+        <w:t xml:space="preserve">3. Producción → OP    → Tiempos → aplicá el PQP del producto (o cargá los pasos a mano)</w:t>
+      </w:r>
+      <w:r>
+        <w:br/>
+      </w:r>
+      <w:r>
+        <w:rPr>
+          <w:rStyle w:val="VerbatimChar"/>
+        </w:rPr>
+        <w:t xml:space="preserve">4. Producción         → cronometrá los pasos; en cada HOLD/WITNESS: Calidad firma QC</w:t>
+      </w:r>
+      <w:r>
+        <w:br/>
+      </w:r>
+      <w:r>
+        <w:rPr>
+          <w:rStyle w:val="VerbatimChar"/>
+        </w:rPr>
+        <w:t xml:space="preserve">5. Producción         → botón Ensayo → registrá hidrostático/dimensional/etc. con instrumento calibrado</w:t>
+      </w:r>
+      <w:r>
+        <w:br/>
+      </w:r>
+      <w:r>
+        <w:rPr>
+          <w:rStyle w:val="VerbatimChar"/>
+        </w:rPr>
+        <w:t xml:space="preserve">6. Producción → OP    → estado = completada (solo si no quedan puntos sin firmar)</w:t>
+      </w:r>
+      <w:r>
+        <w:br/>
+      </w:r>
+      <w:r>
+        <w:rPr>
+          <w:rStyle w:val="VerbatimChar"/>
+        </w:rPr>
+        <w:t xml:space="preserve">                        → se descuenta MP y nace el Producto Terminado</w:t>
+      </w:r>
+      <w:r>
+        <w:br/>
+      </w:r>
+      <w:r>
+        <w:rPr>
+          <w:rStyle w:val="VerbatimChar"/>
+        </w:rPr>
+        <w:t xml:space="preserve">7. Análisis → Trazabilidad     → verificá la cadena certificado → colada → barra → OP → PT</w:t>
+      </w:r>
+    </w:p>
+    <w:bookmarkEnd w:id="74"/>
+    <w:bookmarkStart w:id="75" w:name="Xf9a70cdce17ec8d32f80fb3b897c3b5e5c61186"/>
+    <w:p>
+      <w:pPr>
+        <w:pStyle w:val="Heading3"/>
+      </w:pPr>
+      <w:r>
+        <w:t xml:space="preserve">Circuito D — Tratar un problema de calidad (NC → CAPA)</w:t>
+      </w:r>
+    </w:p>
+    <w:p>
+      <w:pPr>
+        <w:pStyle w:val="SourceCode"/>
+      </w:pPr>
+      <w:r>
+        <w:rPr>
+          <w:rStyle w:val="VerbatimChar"/>
+        </w:rPr>
+        <w:t xml:space="preserve">1. Se detecta el problema   → recepción rechazada, ensayo no conforme o reclamo de cliente</w:t>
+      </w:r>
+      <w:r>
+        <w:br/>
+      </w:r>
+      <w:r>
+        <w:rPr>
+          <w:rStyle w:val="VerbatimChar"/>
+        </w:rPr>
+        <w:t xml:space="preserve">2. Calidad → NCR            → + Nueva NC → origen + vínculos (OP/recepción/venta/ensayo) + descripción</w:t>
+      </w:r>
+      <w:r>
+        <w:br/>
+      </w:r>
+      <w:r>
+        <w:rPr>
+          <w:rStyle w:val="VerbatimChar"/>
+        </w:rPr>
+        <w:t xml:space="preserve">3. Definí la disposición    → retrabajo / reproceso / rechazo / concesión (con justificación) / devolución</w:t>
+      </w:r>
+      <w:r>
+        <w:br/>
+      </w:r>
+      <w:r>
+        <w:rPr>
+          <w:rStyle w:val="VerbatimChar"/>
+        </w:rPr>
+        <w:t xml:space="preserve">4. Si amerita atacar la causa: + Nueva CAPA → causa raíz → acción → responsable → fecha compromiso</w:t>
+      </w:r>
+      <w:r>
+        <w:br/>
+      </w:r>
+      <w:r>
+        <w:rPr>
+          <w:rStyle w:val="VerbatimChar"/>
+        </w:rPr>
+        <w:t xml:space="preserve">5. Implementá la acción     → cargá fecha de implementación</w:t>
+      </w:r>
+      <w:r>
+        <w:br/>
+      </w:r>
+      <w:r>
+        <w:rPr>
+          <w:rStyle w:val="VerbatimChar"/>
+        </w:rPr>
+        <w:t xml:space="preserve">6. Verificá la eficacia     → cargá cómo lo comprobaste + ¿Eficaz? → cerrá la CAPA</w:t>
+      </w:r>
+      <w:r>
+        <w:br/>
+      </w:r>
+      <w:r>
+        <w:rPr>
+          <w:rStyle w:val="VerbatimChar"/>
+        </w:rPr>
+        <w:t xml:space="preserve">7. Cerrá la NC              → (si es de origen cliente, antes marcá "Cliente notificado = Sí")</w:t>
+      </w:r>
+    </w:p>
+    <w:p>
+      <w:pPr>
+        <w:pStyle w:val="FirstParagraph"/>
+      </w:pPr>
+      <w:r>
+        <w:rPr>
+          <w:i/>
+          <w:iCs/>
+        </w:rPr>
+        <w:t xml:space="preserve">El sistema no te deja saltear los pasos 3, 6 y 7: son los candados del SGC.</w:t>
+      </w:r>
+    </w:p>
+    <w:p>
+      <w:r>
+        <w:pict>
+          <v:rect style="width:0;height:1.5pt" o:hralign="center" o:hrstd="t" o:hr="t"/>
+        </w:pict>
+      </w:r>
+    </w:p>
+    <w:bookmarkEnd w:id="75"/>
+    <w:bookmarkEnd w:id="76"/>
+    <w:bookmarkStart w:id="77" w:name="reglas-de-oro-y-errores-comunes"/>
     <w:p>
       <w:pPr>
         <w:pStyle w:val="Heading2"/>
@@ -19227,8 +19840,8 @@
         </w:pict>
       </w:r>
     </w:p>
-    <w:bookmarkEnd w:id="70"/>
-    <w:bookmarkStart w:id="71" w:name="preguntas-frecuentes"/>
+    <w:bookmarkEnd w:id="77"/>
+    <w:bookmarkStart w:id="78" w:name="preguntas-frecuentes"/>
     <w:p>
       <w:pPr>
         <w:pStyle w:val="Heading2"/>
@@ -19641,8 +20254,8 @@
         <w:t xml:space="preserve">Manual de usuario de VitalStock ERP. Ante dudas o errores que no figuran acá, contactá al administrador del sistema.</w:t>
       </w:r>
     </w:p>
-    <w:bookmarkEnd w:id="71"/>
-    <w:bookmarkEnd w:id="72"/>
+    <w:bookmarkEnd w:id="78"/>
+    <w:bookmarkEnd w:id="79"/>
     <w:sectPr>
       <w:footnotePr>
         <w:numRestart w:val="eachSect"/>
@@ -20230,9 +20843,75 @@
     <w:abstractNumId w:val="991"/>
   </w:num>
   <w:num w:numId="1024">
+    <w:abstractNumId w:val="99411"/>
+    <w:lvlOverride w:ilvl="0">
+      <w:startOverride w:val="1"/>
+    </w:lvlOverride>
+    <w:lvlOverride w:ilvl="1">
+      <w:startOverride w:val="1"/>
+    </w:lvlOverride>
+    <w:lvlOverride w:ilvl="2">
+      <w:startOverride w:val="1"/>
+    </w:lvlOverride>
+    <w:lvlOverride w:ilvl="3">
+      <w:startOverride w:val="1"/>
+    </w:lvlOverride>
+    <w:lvlOverride w:ilvl="4">
+      <w:startOverride w:val="1"/>
+    </w:lvlOverride>
+    <w:lvlOverride w:ilvl="5">
+      <w:startOverride w:val="1"/>
+    </w:lvlOverride>
+    <w:lvlOverride w:ilvl="6">
+      <w:startOverride w:val="1"/>
+    </w:lvlOverride>
+    <w:lvlOverride w:ilvl="7">
+      <w:startOverride w:val="1"/>
+    </w:lvlOverride>
+    <w:lvlOverride w:ilvl="8">
+      <w:startOverride w:val="1"/>
+    </w:lvlOverride>
+  </w:num>
+  <w:num w:numId="1025">
     <w:abstractNumId w:val="991"/>
   </w:num>
-  <w:num w:numId="1025">
+  <w:num w:numId="1026">
+    <w:abstractNumId w:val="991"/>
+  </w:num>
+  <w:num w:numId="1027">
+    <w:abstractNumId w:val="99411"/>
+    <w:lvlOverride w:ilvl="0">
+      <w:startOverride w:val="1"/>
+    </w:lvlOverride>
+    <w:lvlOverride w:ilvl="1">
+      <w:startOverride w:val="1"/>
+    </w:lvlOverride>
+    <w:lvlOverride w:ilvl="2">
+      <w:startOverride w:val="1"/>
+    </w:lvlOverride>
+    <w:lvlOverride w:ilvl="3">
+      <w:startOverride w:val="1"/>
+    </w:lvlOverride>
+    <w:lvlOverride w:ilvl="4">
+      <w:startOverride w:val="1"/>
+    </w:lvlOverride>
+    <w:lvlOverride w:ilvl="5">
+      <w:startOverride w:val="1"/>
+    </w:lvlOverride>
+    <w:lvlOverride w:ilvl="6">
+      <w:startOverride w:val="1"/>
+    </w:lvlOverride>
+    <w:lvlOverride w:ilvl="7">
+      <w:startOverride w:val="1"/>
+    </w:lvlOverride>
+    <w:lvlOverride w:ilvl="8">
+      <w:startOverride w:val="1"/>
+    </w:lvlOverride>
+  </w:num>
+  <w:num w:numId="1028">
+    <w:abstractNumId w:val="991"/>
+  </w:num>
+  <w:num w:numId="1029">
     <w:abstractNumId w:val="991"/>
   </w:num>
 </w:numbering>

</xml_diff>

<commit_message>
fix(facturacion): mostrar código y motivo del rechazo de ARCA al facturar
Los tres emisores (factura desde venta, factura directa, NC/ND) mostraban
solo "AFIP rechazó la solicitud de CAE" y escondían `errores` y
`observaciones` que devuelve la Edge Function. Con las validaciones nuevas
del WSFEv1 (10247 CUIT inactiva, 10248 no confiable, 10284 doc≠CUIT, 10015
consumidor final sin identificar) el usuario no sabía qué corregir.

- `mensajeErrorFacturacion(detail,statusText)` puro: "[código] motivo · …".
- notify(): los errores largos duran hasta 20 s y el timer se reinicia;
  .notif con ancho máximo para que el motivo no se salga de pantalla.
- Manual 8.4: qué hace Ver CAE, cómo leer un rechazo, dónde aparece la
  factura en ARCA (Mis Comprobantes, al día siguiente). + .docx.
- Comentario RG 5616 corregido: rechazo desde el 1/12/2026 (manual v4.8).

Tests: 4 nuevos en tests/facturacion.test.js — suite 379/379.

Co-Authored-By: Claude Fable 5.1 <noreply@anthropic.com>
</commit_message>
<xml_diff>
--- a/docs/MANUAL_USUARIO.docx
+++ b/docs/MANUAL_USUARIO.docx
@@ -11020,7 +11020,23 @@
         <w:t xml:space="preserve"> </w:t>
       </w:r>
       <w:r>
-        <w:t xml:space="preserve">(comprobante con QR para imprimir o mandar) y</w:t>
+        <w:t xml:space="preserve">(muestra número, CAE y vencimiento, y ofrece abrir la página de</w:t>
+      </w:r>
+      <w:r>
+        <w:t xml:space="preserve"> </w:t>
+      </w:r>
+      <w:r>
+        <w:rPr>
+          <w:b/>
+          <w:bCs/>
+        </w:rPr>
+        <w:t xml:space="preserve">Constatación de Comprobantes</w:t>
+      </w:r>
+      <w:r>
+        <w:t xml:space="preserve"> </w:t>
+      </w:r>
+      <w:r>
+        <w:t xml:space="preserve">de ARCA con los datos precargados: escribís el captcha y ARCA confirma que el comprobante está autorizado) y</w:t>
       </w:r>
       <w:r>
         <w:t xml:space="preserve"> </w:t>
@@ -11036,7 +11052,146 @@
         <w:t xml:space="preserve"> </w:t>
       </w:r>
       <w:r>
-        <w:t xml:space="preserve">sobre cualquier factura.</w:t>
+        <w:t xml:space="preserve">sobre cualquier factura. El ERP todavía</w:t>
+      </w:r>
+      <w:r>
+        <w:t xml:space="preserve"> </w:t>
+      </w:r>
+      <w:r>
+        <w:rPr>
+          <w:b/>
+          <w:bCs/>
+        </w:rPr>
+        <w:t xml:space="preserve">no arma el PDF de la factura</w:t>
+      </w:r>
+      <w:r>
+        <w:t xml:space="preserve"> </w:t>
+      </w:r>
+      <w:r>
+        <w:t xml:space="preserve">para mandar al cliente.</w:t>
+      </w:r>
+    </w:p>
+    <w:p>
+      <w:pPr>
+        <w:pStyle w:val="Compact"/>
+        <w:numPr>
+          <w:ilvl w:val="0"/>
+          <w:numId w:val="1014"/>
+        </w:numPr>
+      </w:pPr>
+      <w:r>
+        <w:rPr>
+          <w:b/>
+          <w:bCs/>
+        </w:rPr>
+        <w:t xml:space="preserve">Si ARCA rechaza un comprobante</w:t>
+      </w:r>
+      <w:r>
+        <w:t xml:space="preserve">, el cartel rojo muestra el</w:t>
+      </w:r>
+      <w:r>
+        <w:t xml:space="preserve"> </w:t>
+      </w:r>
+      <w:r>
+        <w:rPr>
+          <w:b/>
+          <w:bCs/>
+        </w:rPr>
+        <w:t xml:space="preserve">código y el motivo</w:t>
+      </w:r>
+      <w:r>
+        <w:t xml:space="preserve"> </w:t>
+      </w:r>
+      <w:r>
+        <w:t xml:space="preserve">que devolvió ARCA (ej.:</w:t>
+      </w:r>
+      <w:r>
+        <w:t xml:space="preserve"> </w:t>
+      </w:r>
+      <w:r>
+        <w:rPr>
+          <w:rStyle w:val="VerbatimChar"/>
+        </w:rPr>
+        <w:t xml:space="preserve">[10247] La CUIT receptora informada está inactiva o es inválida</w:t>
+      </w:r>
+      <w:r>
+        <w:t xml:space="preserve">). Corregí lo que indica (CUIT o condición fiscal del cliente en su ficha, importes) y volvé a facturar: un rechazo no consume número ni CAE.</w:t>
+      </w:r>
+    </w:p>
+    <w:p>
+      <w:pPr>
+        <w:pStyle w:val="Compact"/>
+        <w:numPr>
+          <w:ilvl w:val="0"/>
+          <w:numId w:val="1014"/>
+        </w:numPr>
+      </w:pPr>
+      <w:r>
+        <w:rPr>
+          <w:b/>
+          <w:bCs/>
+        </w:rPr>
+        <w:t xml:space="preserve">Dónde ver una factura en ARCA:</w:t>
+      </w:r>
+      <w:r>
+        <w:t xml:space="preserve"> </w:t>
+      </w:r>
+      <w:r>
+        <w:t xml:space="preserve">las emitidas por el ERP</w:t>
+      </w:r>
+      <w:r>
+        <w:t xml:space="preserve"> </w:t>
+      </w:r>
+      <w:r>
+        <w:rPr>
+          <w:b/>
+          <w:bCs/>
+        </w:rPr>
+        <w:t xml:space="preserve">no</w:t>
+      </w:r>
+      <w:r>
+        <w:t xml:space="preserve"> </w:t>
+      </w:r>
+      <w:r>
+        <w:t xml:space="preserve">aparecen en</w:t>
+      </w:r>
+      <w:r>
+        <w:t xml:space="preserve"> </w:t>
+      </w:r>
+      <w:r>
+        <w:t xml:space="preserve">“Comprobantes en línea”</w:t>
+      </w:r>
+      <w:r>
+        <w:t xml:space="preserve">; aparecen en</w:t>
+      </w:r>
+      <w:r>
+        <w:t xml:space="preserve"> </w:t>
+      </w:r>
+      <w:r>
+        <w:rPr>
+          <w:b/>
+          <w:bCs/>
+        </w:rPr>
+        <w:t xml:space="preserve">Mis Comprobantes → Emitidos</w:t>
+      </w:r>
+      <w:r>
+        <w:t xml:space="preserve"> </w:t>
+      </w:r>
+      <w:r>
+        <w:t xml:space="preserve">(punto de venta 4), normalmente</w:t>
+      </w:r>
+      <w:r>
+        <w:t xml:space="preserve"> </w:t>
+      </w:r>
+      <w:r>
+        <w:rPr>
+          <w:b/>
+          <w:bCs/>
+        </w:rPr>
+        <w:t xml:space="preserve">al día siguiente</w:t>
+      </w:r>
+      <w:r>
+        <w:t xml:space="preserve">.</w:t>
       </w:r>
     </w:p>
     <w:p>

</xml_diff>

<commit_message>
feat(compras): pago parcial de facturas de proveedor sin fricción en la OP
Antes, "Pagar" abría la orden de pago con la imputación fijada al saldo
completo; si el usuario cargaba un medio menor, la validación rechazaba
("las imputaciones superan el total") y parecía que no se podía pagar en
partes. Ahora la imputación de las facturas tildadas sigue al total de
los medios (repartirImputacionesOP: manuales primero, auto después,
la más vieja primero, nunca más que el saldo), el medio arranca con el
saldo de la factura, la fila muestra "pago parcial · quedan X", vaciar
el importe vuelve a auto, y la lista de facturas recibidas marca
PARCIAL con lo pagado. Manual §7.5 + docx. Tests 387/387.

Co-Authored-By: Claude Fable 5.1 <noreply@anthropic.com>
</commit_message>
<xml_diff>
--- a/docs/MANUAL_USUARIO.docx
+++ b/docs/MANUAL_USUARIO.docx
@@ -8585,20 +8585,45 @@
         <w:t xml:space="preserve"> </w:t>
       </w:r>
       <w:r>
-        <w:t xml:space="preserve">con el saldo de cada una (las vencidas en rojo). Tildá las que cancelás; el monto a imputar se completa con el saldo y podés bajarlo para un</w:t>
-      </w:r>
-      <w:r>
-        <w:t xml:space="preserve"> </w:t>
-      </w:r>
-      <w:r>
-        <w:rPr>
-          <w:b/>
-          <w:bCs/>
-        </w:rPr>
-        <w:t xml:space="preserve">pago parcial</w:t>
-      </w:r>
-      <w:r>
-        <w:t xml:space="preserve">.</w:t>
+        <w:t xml:space="preserve">con el saldo de cada una (las vencidas en rojo). Tildá las que pagás. El monto a imputar de cada factura tildada</w:t>
+      </w:r>
+      <w:r>
+        <w:t xml:space="preserve"> </w:t>
+      </w:r>
+      <w:r>
+        <w:rPr>
+          <w:b/>
+          <w:bCs/>
+        </w:rPr>
+        <w:t xml:space="preserve">sigue solo al total de los medios</w:t>
+      </w:r>
+      <w:r>
+        <w:t xml:space="preserve">: si la factura es de $121.000 y cargás una transferencia de $40.000, se imputan $40.000 y la factura queda con saldo $81.000 (abajo de la fila ves</w:t>
+      </w:r>
+      <w:r>
+        <w:t xml:space="preserve"> </w:t>
+      </w:r>
+      <w:r>
+        <w:t xml:space="preserve">“pago parcial · quedan…”</w:t>
+      </w:r>
+      <w:r>
+        <w:t xml:space="preserve">). Si preferís fijar el importe a mano, escribilo en la columna</w:t>
+      </w:r>
+      <w:r>
+        <w:t xml:space="preserve"> </w:t>
+      </w:r>
+      <w:r>
+        <w:rPr>
+          <w:b/>
+          <w:bCs/>
+        </w:rPr>
+        <w:t xml:space="preserve">Imputar</w:t>
+      </w:r>
+      <w:r>
+        <w:t xml:space="preserve"> </w:t>
+      </w:r>
+      <w:r>
+        <w:t xml:space="preserve">(borrá el número para que vuelva a ser automático).</w:t>
       </w:r>
       <w:r>
         <w:t xml:space="preserve"> </w:t>
@@ -8614,19 +8639,79 @@
         <w:t xml:space="preserve"> </w:t>
       </w:r>
       <w:r>
-        <w:t xml:space="preserve">reparte el total de los medios entre las facturas, la más vieja primero.</w:t>
-      </w:r>
-    </w:p>
-    <w:p>
-      <w:pPr>
-        <w:pStyle w:val="Compact"/>
-        <w:numPr>
-          <w:ilvl w:val="0"/>
-          <w:numId w:val="1012"/>
-        </w:numPr>
-      </w:pPr>
-      <w:r>
-        <w:t xml:space="preserve">Cargá los</w:t>
+        <w:t xml:space="preserve">reparte el total de los medios entre todas las facturas, la más vieja primero.</w:t>
+      </w:r>
+    </w:p>
+    <w:p>
+      <w:pPr>
+        <w:pStyle w:val="FirstParagraph"/>
+      </w:pPr>
+      <w:r>
+        <w:rPr>
+          <w:b/>
+          <w:bCs/>
+        </w:rPr>
+        <w:t xml:space="preserve">Pagar en partes (pago parcial):</w:t>
+      </w:r>
+      <w:r>
+        <w:t xml:space="preserve"> </w:t>
+      </w:r>
+      <w:r>
+        <w:t xml:space="preserve">desde el botón</w:t>
+      </w:r>
+      <w:r>
+        <w:t xml:space="preserve"> </w:t>
+      </w:r>
+      <w:r>
+        <w:rPr>
+          <w:b/>
+          <w:bCs/>
+        </w:rPr>
+        <w:t xml:space="preserve">Pagar</w:t>
+      </w:r>
+      <w:r>
+        <w:t xml:space="preserve"> </w:t>
+      </w:r>
+      <w:r>
+        <w:t xml:space="preserve">de la factura, la OP se abre con la factura tildada y el medio cargado con el saldo completo. Bajá el monto del medio a lo que pagás hoy y registrá. La factura queda marcada</w:t>
+      </w:r>
+      <w:r>
+        <w:t xml:space="preserve"> </w:t>
+      </w:r>
+      <w:r>
+        <w:rPr>
+          <w:b/>
+          <w:bCs/>
+        </w:rPr>
+        <w:t xml:space="preserve">PARCIAL</w:t>
+      </w:r>
+      <w:r>
+        <w:t xml:space="preserve"> </w:t>
+      </w:r>
+      <w:r>
+        <w:t xml:space="preserve">en la lista con lo pagado y el saldo; la próxima vez que apretás</w:t>
+      </w:r>
+      <w:r>
+        <w:t xml:space="preserve"> </w:t>
+      </w:r>
+      <w:r>
+        <w:rPr>
+          <w:b/>
+          <w:bCs/>
+        </w:rPr>
+        <w:t xml:space="preserve">Pagar</w:t>
+      </w:r>
+      <w:r>
+        <w:t xml:space="preserve"> </w:t>
+      </w:r>
+      <w:r>
+        <w:t xml:space="preserve">sale sólo el saldo que falta. Podés hacer tantas OPs como cuotas haya; cada una lleva su asiento y su PDF.</w:t>
+      </w:r>
+      <w:r>
+        <w:t xml:space="preserve"> </w:t>
+      </w:r>
+      <w:r>
+        <w:t xml:space="preserve">3. Cargá los</w:t>
       </w:r>
       <w:r>
         <w:t xml:space="preserve"> </w:t>
@@ -8702,17 +8787,11 @@
       <w:r>
         <w:t xml:space="preserve">. Podés combinar los que quieras: una transferencia más dos cheques para la misma factura, por ejemplo.</w:t>
       </w:r>
-    </w:p>
-    <w:p>
-      <w:pPr>
-        <w:pStyle w:val="Compact"/>
-        <w:numPr>
-          <w:ilvl w:val="0"/>
-          <w:numId w:val="1012"/>
-        </w:numPr>
-      </w:pPr>
-      <w:r>
-        <w:t xml:space="preserve">La barra de abajo muestra</w:t>
+      <w:r>
+        <w:t xml:space="preserve"> </w:t>
+      </w:r>
+      <w:r>
+        <w:t xml:space="preserve">4. La barra de abajo muestra</w:t>
       </w:r>
       <w:r>
         <w:t xml:space="preserve"> </w:t>
@@ -8759,15 +8838,15 @@
       <w:r>
         <w:t xml:space="preserve">(lo que no imputaste a ninguna factura: queda como saldo a favor con el proveedor y descuenta de su deuda). Si hay diferencia el sistema te avisa antes de registrar.</w:t>
       </w:r>
-    </w:p>
-    <w:p>
-      <w:pPr>
-        <w:pStyle w:val="Compact"/>
-        <w:numPr>
-          <w:ilvl w:val="0"/>
-          <w:numId w:val="1012"/>
-        </w:numPr>
-      </w:pPr>
+      <w:r>
+        <w:t xml:space="preserve"> </w:t>
+      </w:r>
+      <w:r>
+        <w:t xml:space="preserve">5.</w:t>
+      </w:r>
+      <w:r>
+        <w:t xml:space="preserve"> </w:t>
+      </w:r>
       <w:r>
         <w:rPr>
           <w:b/>
@@ -8809,7 +8888,7 @@
     </w:p>
     <w:p>
       <w:pPr>
-        <w:pStyle w:val="FirstParagraph"/>
+        <w:pStyle w:val="BodyText"/>
       </w:pPr>
       <w:r>
         <w:rPr>

</xml_diff>

<commit_message>
feat(ventas): ejemplares original / duplicado / triplicado en el PDF de comprobantes
Co-Authored-By: Claude Opus 5.5 <noreply@anthropic.com>
</commit_message>
<xml_diff>
--- a/docs/MANUAL_USUARIO.docx
+++ b/docs/MANUAL_USUARIO.docx
@@ -12121,6 +12121,92 @@
       </w:r>
       <w:r>
         <w:t xml:space="preserve">. Mientras falten, salen con una raya y el sistema te lo recuerda al imprimir.</w:t>
+      </w:r>
+    </w:p>
+    <w:p>
+      <w:pPr>
+        <w:pStyle w:val="Compact"/>
+        <w:numPr>
+          <w:ilvl w:val="0"/>
+          <w:numId w:val="1016"/>
+        </w:numPr>
+      </w:pPr>
+      <w:r>
+        <w:rPr>
+          <w:b/>
+          <w:bCs/>
+        </w:rPr>
+        <w:t xml:space="preserve">Ejemplares:</w:t>
+      </w:r>
+      <w:r>
+        <w:t xml:space="preserve"> </w:t>
+      </w:r>
+      <w:r>
+        <w:t xml:space="preserve">el selector de la barra define cuántas hojas lleva cada comprobante:</w:t>
+      </w:r>
+      <w:r>
+        <w:t xml:space="preserve"> </w:t>
+      </w:r>
+      <w:r>
+        <w:rPr>
+          <w:b/>
+          <w:bCs/>
+        </w:rPr>
+        <w:t xml:space="preserve">original + duplicado + triplicado</w:t>
+      </w:r>
+      <w:r>
+        <w:t xml:space="preserve"> </w:t>
+      </w:r>
+      <w:r>
+        <w:t xml:space="preserve">(lo que viene elegido),</w:t>
+      </w:r>
+      <w:r>
+        <w:t xml:space="preserve"> </w:t>
+      </w:r>
+      <w:r>
+        <w:rPr>
+          <w:b/>
+          <w:bCs/>
+        </w:rPr>
+        <w:t xml:space="preserve">original + duplicado</w:t>
+      </w:r>
+      <w:r>
+        <w:t xml:space="preserve"> </w:t>
+      </w:r>
+      <w:r>
+        <w:t xml:space="preserve">o</w:t>
+      </w:r>
+      <w:r>
+        <w:t xml:space="preserve"> </w:t>
+      </w:r>
+      <w:r>
+        <w:rPr>
+          <w:b/>
+          <w:bCs/>
+        </w:rPr>
+        <w:t xml:space="preserve">sólo original</w:t>
+      </w:r>
+      <w:r>
+        <w:t xml:space="preserve"> </w:t>
+      </w:r>
+      <w:r>
+        <w:t xml:space="preserve">(cómodo para mandar por mail). Queda guardado en tu navegador y vale también para el botón</w:t>
+      </w:r>
+      <w:r>
+        <w:t xml:space="preserve"> </w:t>
+      </w:r>
+      <w:r>
+        <w:rPr>
+          <w:b/>
+          <w:bCs/>
+        </w:rPr>
+        <w:t xml:space="preserve">Factura</w:t>
+      </w:r>
+      <w:r>
+        <w:t xml:space="preserve"> </w:t>
+      </w:r>
+      <w:r>
+        <w:t xml:space="preserve">de Ventas.</w:t>
       </w:r>
     </w:p>
     <w:p>

</xml_diff>

<commit_message>
feat(ventas): remito con domicilio de entrega, transporte, bultos, valor declarado y OC del cliente (mig 088)
Co-Authored-By: Claude Opus 5.5 <noreply@anthropic.com>
</commit_message>
<xml_diff>
--- a/docs/MANUAL_USUARIO.docx
+++ b/docs/MANUAL_USUARIO.docx
@@ -11435,6 +11435,130 @@
       </w:r>
       <w:r>
         <w:t xml:space="preserve">de facturar.</w:t>
+      </w:r>
+    </w:p>
+    <w:p>
+      <w:pPr>
+        <w:pStyle w:val="FirstParagraph"/>
+      </w:pPr>
+      <w:r>
+        <w:rPr>
+          <w:b/>
+          <w:bCs/>
+        </w:rPr>
+        <w:t xml:space="preserve">Datos de la entrega en el remito.</w:t>
+      </w:r>
+      <w:r>
+        <w:t xml:space="preserve"> </w:t>
+      </w:r>
+      <w:r>
+        <w:t xml:space="preserve">El botón</w:t>
+      </w:r>
+      <w:r>
+        <w:t xml:space="preserve"> </w:t>
+      </w:r>
+      <w:r>
+        <w:rPr>
+          <w:b/>
+          <w:bCs/>
+        </w:rPr>
+        <w:t xml:space="preserve">Remito</w:t>
+      </w:r>
+      <w:r>
+        <w:t xml:space="preserve"> </w:t>
+      </w:r>
+      <w:r>
+        <w:t xml:space="preserve">de cada venta abre primero una ventana con los datos que tiene que llevar el remito:</w:t>
+      </w:r>
+      <w:r>
+        <w:t xml:space="preserve"> </w:t>
+      </w:r>
+      <w:r>
+        <w:rPr>
+          <w:b/>
+          <w:bCs/>
+        </w:rPr>
+        <w:t xml:space="preserve">domicilio de entrega</w:t>
+      </w:r>
+      <w:r>
+        <w:t xml:space="preserve"> </w:t>
+      </w:r>
+      <w:r>
+        <w:t xml:space="preserve">(viene el del cliente; cambialo si se entrega en otro lado),</w:t>
+      </w:r>
+      <w:r>
+        <w:t xml:space="preserve"> </w:t>
+      </w:r>
+      <w:r>
+        <w:rPr>
+          <w:b/>
+          <w:bCs/>
+        </w:rPr>
+        <w:t xml:space="preserve">transporte</w:t>
+      </w:r>
+      <w:r>
+        <w:t xml:space="preserve">,</w:t>
+      </w:r>
+      <w:r>
+        <w:t xml:space="preserve"> </w:t>
+      </w:r>
+      <w:r>
+        <w:rPr>
+          <w:b/>
+          <w:bCs/>
+        </w:rPr>
+        <w:t xml:space="preserve">N° de orden de compra del cliente</w:t>
+      </w:r>
+      <w:r>
+        <w:t xml:space="preserve">,</w:t>
+      </w:r>
+      <w:r>
+        <w:t xml:space="preserve"> </w:t>
+      </w:r>
+      <w:r>
+        <w:rPr>
+          <w:b/>
+          <w:bCs/>
+        </w:rPr>
+        <w:t xml:space="preserve">cantidad de bultos</w:t>
+      </w:r>
+      <w:r>
+        <w:t xml:space="preserve"> </w:t>
+      </w:r>
+      <w:r>
+        <w:t xml:space="preserve">y</w:t>
+      </w:r>
+      <w:r>
+        <w:t xml:space="preserve"> </w:t>
+      </w:r>
+      <w:r>
+        <w:rPr>
+          <w:b/>
+          <w:bCs/>
+        </w:rPr>
+        <w:t xml:space="preserve">valor declarado</w:t>
+      </w:r>
+      <w:r>
+        <w:t xml:space="preserve"> </w:t>
+      </w:r>
+      <w:r>
+        <w:t xml:space="preserve">(viene el total de la venta sin IVA, en dólares; podés corregirlo o pasarlo a pesos). Con</w:t>
+      </w:r>
+      <w:r>
+        <w:t xml:space="preserve"> </w:t>
+      </w:r>
+      <w:r>
+        <w:rPr>
+          <w:b/>
+          <w:bCs/>
+        </w:rPr>
+        <w:t xml:space="preserve">Guardar y generar remito</w:t>
+      </w:r>
+      <w:r>
+        <w:t xml:space="preserve"> </w:t>
+      </w:r>
+      <w:r>
+        <w:t xml:space="preserve">los datos quedan guardados en la venta y baja el PDF; la próxima vez que lo abras ya vienen cargados. En el saldo de una entrega parcial, la orden de compra, el domicilio y el transporte se traen de la venta original. Un campo que dejes vacío sale con una raya.</w:t>
       </w:r>
     </w:p>
     <w:bookmarkEnd w:id="36"/>

</xml_diff>

<commit_message>
feat(ventas): OC del cliente en el pedido, el listado, la búsqueda y la factura
Co-Authored-By: Claude Opus 5.5 <noreply@anthropic.com>
</commit_message>
<xml_diff>
--- a/docs/MANUAL_USUARIO.docx
+++ b/docs/MANUAL_USUARIO.docx
@@ -11862,6 +11862,124 @@
       </w:r>
       <w:r>
         <w:t xml:space="preserve">los datos quedan guardados en la venta y baja el PDF; la próxima vez que lo abras ya vienen cargados. En el saldo de una entrega parcial, la orden de compra, el domicilio y el transporte se traen de la venta original. Un campo que dejes vacío sale con una raya.</w:t>
+      </w:r>
+    </w:p>
+    <w:p>
+      <w:pPr>
+        <w:pStyle w:val="BodyText"/>
+      </w:pPr>
+      <w:r>
+        <w:rPr>
+          <w:b/>
+          <w:bCs/>
+        </w:rPr>
+        <w:t xml:space="preserve">OC del cliente:</w:t>
+      </w:r>
+      <w:r>
+        <w:t xml:space="preserve"> </w:t>
+      </w:r>
+      <w:r>
+        <w:t xml:space="preserve">en el pedido (sección</w:t>
+      </w:r>
+      <w:r>
+        <w:t xml:space="preserve"> </w:t>
+      </w:r>
+      <w:r>
+        <w:rPr>
+          <w:i/>
+          <w:iCs/>
+        </w:rPr>
+        <w:t xml:space="preserve">Condiciones comerciales</w:t>
+      </w:r>
+      <w:r>
+        <w:t xml:space="preserve">) cargás el</w:t>
+      </w:r>
+      <w:r>
+        <w:t xml:space="preserve"> </w:t>
+      </w:r>
+      <w:r>
+        <w:rPr>
+          <w:b/>
+          <w:bCs/>
+        </w:rPr>
+        <w:t xml:space="preserve">número de orden de compra del cliente</w:t>
+      </w:r>
+      <w:r>
+        <w:t xml:space="preserve">. Queda a la vista en la lista de ventas debajo del número de pedido, se puede</w:t>
+      </w:r>
+      <w:r>
+        <w:t xml:space="preserve"> </w:t>
+      </w:r>
+      <w:r>
+        <w:rPr>
+          <w:b/>
+          <w:bCs/>
+        </w:rPr>
+        <w:t xml:space="preserve">buscar</w:t>
+      </w:r>
+      <w:r>
+        <w:t xml:space="preserve"> </w:t>
+      </w:r>
+      <w:r>
+        <w:t xml:space="preserve">por ese número, sale en el</w:t>
+      </w:r>
+      <w:r>
+        <w:t xml:space="preserve"> </w:t>
+      </w:r>
+      <w:r>
+        <w:rPr>
+          <w:b/>
+          <w:bCs/>
+        </w:rPr>
+        <w:t xml:space="preserve">remito</w:t>
+      </w:r>
+      <w:r>
+        <w:t xml:space="preserve"> </w:t>
+      </w:r>
+      <w:r>
+        <w:t xml:space="preserve">y en el</w:t>
+      </w:r>
+      <w:r>
+        <w:t xml:space="preserve"> </w:t>
+      </w:r>
+      <w:r>
+        <w:rPr>
+          <w:b/>
+          <w:bCs/>
+        </w:rPr>
+        <w:t xml:space="preserve">PDF de la factura</w:t>
+      </w:r>
+      <w:r>
+        <w:t xml:space="preserve">, y va en el Excel. Lo cargás al tomar el pedido o editándolo después. Si la venta</w:t>
+      </w:r>
+      <w:r>
+        <w:t xml:space="preserve"> </w:t>
+      </w:r>
+      <w:r>
+        <w:rPr>
+          <w:b/>
+          <w:bCs/>
+        </w:rPr>
+        <w:t xml:space="preserve">ya está facturada</w:t>
+      </w:r>
+      <w:r>
+        <w:t xml:space="preserve"> </w:t>
+      </w:r>
+      <w:r>
+        <w:t xml:space="preserve">(el pedido no se puede editar), cargalo o corregilo desde el botón</w:t>
+      </w:r>
+      <w:r>
+        <w:t xml:space="preserve"> </w:t>
+      </w:r>
+      <w:r>
+        <w:rPr>
+          <w:b/>
+          <w:bCs/>
+        </w:rPr>
+        <w:t xml:space="preserve">Remito</w:t>
+      </w:r>
+      <w:r>
+        <w:t xml:space="preserve">.</w:t>
       </w:r>
     </w:p>
     <w:bookmarkEnd w:id="37"/>

</xml_diff>